<commit_message>
Update 简历 钱佳宏.docx with compact A4 format (photo placeholder added)
</commit_message>
<xml_diff>
--- a/简历 钱佳宏.docx
+++ b/简历 钱佳宏.docx
@@ -2,931 +2,581 @@
 <file path=word/document.xml><?xml version="1.0" encoding="utf-8"?>
 <w:document xmlns:wpc="http://schemas.microsoft.com/office/word/2010/wordprocessingCanvas" xmlns:mo="http://schemas.microsoft.com/office/mac/office/2008/main" xmlns:mc="http://schemas.openxmlformats.org/markup-compatibility/2006" xmlns:mv="urn:schemas-microsoft-com:mac:vml" xmlns:o="urn:schemas-microsoft-com:office:office" xmlns:r="http://schemas.openxmlformats.org/officeDocument/2006/relationships" xmlns:m="http://schemas.openxmlformats.org/officeDocument/2006/math" xmlns:v="urn:schemas-microsoft-com:vml" xmlns:wp14="http://schemas.microsoft.com/office/word/2010/wordprocessingDrawing" xmlns:wp="http://schemas.openxmlformats.org/drawingml/2006/wordprocessingDrawing" xmlns:w10="urn:schemas-microsoft-com:office:word" xmlns:w="http://schemas.openxmlformats.org/wordprocessingml/2006/main" xmlns:w14="http://schemas.microsoft.com/office/word/2010/wordml" xmlns:wpg="http://schemas.microsoft.com/office/word/2010/wordprocessingGroup" xmlns:wpi="http://schemas.microsoft.com/office/word/2010/wordprocessingInk" xmlns:wne="http://schemas.microsoft.com/office/word/2006/wordml" xmlns:wps="http://schemas.microsoft.com/office/word/2010/wordprocessingShape" mc:Ignorable="w14 wp14">
   <w:body>
+    <w:tbl>
+      <w:tblPr>
+        <w:tblW w:type="auto" w:w="0"/>
+        <w:jc w:val="center"/>
+        <w:tblLook w:firstColumn="1" w:firstRow="1" w:lastColumn="0" w:lastRow="0" w:noHBand="0" w:noVBand="1" w:val="04A0"/>
+      </w:tblPr>
+      <w:tblGrid>
+        <w:gridCol w:w="5100"/>
+        <w:gridCol w:w="5100"/>
+      </w:tblGrid>
+      <w:tr>
+        <w:tc>
+          <w:tcPr>
+            <w:tcW w:type="dxa" w:w="7370"/>
+          </w:tcPr>
+          <w:p>
+            <w:pPr>
+              <w:spacing w:after="80"/>
+              <w:jc w:val="left"/>
+            </w:pPr>
+            <w:r>
+              <w:rPr>
+                <w:rFonts w:ascii="微软雅黑" w:hAnsi="微软雅黑" w:eastAsia="微软雅黑"/>
+                <w:b/>
+                <w:color w:val="1A1A2E"/>
+                <w:sz w:val="44"/>
+              </w:rPr>
+              <w:t>个人简历</w:t>
+            </w:r>
+          </w:p>
+          <w:p>
+            <w:pPr>
+              <w:spacing w:before="0" w:after="0"/>
+            </w:pPr>
+            <w:r>
+              <w:rPr>
+                <w:rFonts w:ascii="微软雅黑" w:hAnsi="微软雅黑" w:eastAsia="微软雅黑"/>
+                <w:b w:val="0"/>
+                <w:i w:val="0"/>
+                <w:color w:val="333333"/>
+                <w:sz w:val="19"/>
+              </w:rPr>
+              <w:t>姓名：钱佳宏</w:t>
+            </w:r>
+          </w:p>
+          <w:p>
+            <w:pPr>
+              <w:spacing w:before="0" w:after="0"/>
+              <w:tabs>
+                <w:tab w:val="left" w:pos="4500"/>
+              </w:tabs>
+            </w:pPr>
+            <w:r>
+              <w:rPr>
+                <w:rFonts w:ascii="微软雅黑" w:hAnsi="微软雅黑" w:eastAsia="微软雅黑"/>
+                <w:b w:val="0"/>
+                <w:i w:val="0"/>
+                <w:color w:val="333333"/>
+                <w:sz w:val="19"/>
+              </w:rPr>
+              <w:t>生日：2006.05.11</w:t>
+            </w:r>
+            <w:r>
+              <w:rPr>
+                <w:rFonts w:ascii="微软雅黑" w:hAnsi="微软雅黑" w:eastAsia="微软雅黑"/>
+                <w:b w:val="0"/>
+                <w:i w:val="0"/>
+                <w:color w:val="333333"/>
+                <w:sz w:val="19"/>
+              </w:rPr>
+              <w:tab/>
+              <w:t>身高：185cm</w:t>
+            </w:r>
+          </w:p>
+          <w:p>
+            <w:pPr>
+              <w:spacing w:before="0" w:after="0"/>
+              <w:tabs>
+                <w:tab w:val="left" w:pos="4500"/>
+              </w:tabs>
+            </w:pPr>
+            <w:r>
+              <w:rPr>
+                <w:rFonts w:ascii="微软雅黑" w:hAnsi="微软雅黑" w:eastAsia="微软雅黑"/>
+                <w:b w:val="0"/>
+                <w:i w:val="0"/>
+                <w:color w:val="333333"/>
+                <w:sz w:val="19"/>
+              </w:rPr>
+              <w:t>学历：本科</w:t>
+            </w:r>
+            <w:r>
+              <w:rPr>
+                <w:rFonts w:ascii="微软雅黑" w:hAnsi="微软雅黑" w:eastAsia="微软雅黑"/>
+                <w:b w:val="0"/>
+                <w:i w:val="0"/>
+                <w:color w:val="333333"/>
+                <w:sz w:val="19"/>
+              </w:rPr>
+              <w:tab/>
+              <w:t>地址：上海市杨浦区</w:t>
+            </w:r>
+          </w:p>
+          <w:p>
+            <w:pPr>
+              <w:spacing w:before="0" w:after="0"/>
+              <w:tabs>
+                <w:tab w:val="left" w:pos="4500"/>
+              </w:tabs>
+            </w:pPr>
+            <w:r>
+              <w:rPr>
+                <w:rFonts w:ascii="微软雅黑" w:hAnsi="微软雅黑" w:eastAsia="微软雅黑"/>
+                <w:b w:val="0"/>
+                <w:i w:val="0"/>
+                <w:color w:val="333333"/>
+                <w:sz w:val="19"/>
+              </w:rPr>
+              <w:t>电话：19921057118</w:t>
+            </w:r>
+            <w:r>
+              <w:rPr>
+                <w:rFonts w:ascii="微软雅黑" w:hAnsi="微软雅黑" w:eastAsia="微软雅黑"/>
+                <w:b w:val="0"/>
+                <w:i w:val="0"/>
+                <w:color w:val="333333"/>
+                <w:sz w:val="19"/>
+              </w:rPr>
+              <w:tab/>
+              <w:t>邮箱：aqfxz_zh@qq.com</w:t>
+            </w:r>
+          </w:p>
+          <w:p>
+            <w:pPr>
+              <w:spacing w:before="60" w:after="0"/>
+            </w:pPr>
+            <w:r>
+              <w:rPr>
+                <w:rFonts w:ascii="微软雅黑" w:hAnsi="微软雅黑" w:eastAsia="微软雅黑"/>
+                <w:b w:val="0"/>
+                <w:i w:val="0"/>
+                <w:color w:val="555555"/>
+                <w:sz w:val="17"/>
+              </w:rPr>
+              <w:t>开源库：https://github.com/lxcxjxhx/HOS-Qian-jia-hong-resume</w:t>
+            </w:r>
+            <w:r>
+              <w:rPr>
+                <w:rFonts w:ascii="微软雅黑" w:hAnsi="微软雅黑" w:eastAsia="微软雅黑"/>
+                <w:b w:val="0"/>
+                <w:i w:val="0"/>
+                <w:color w:val="555555"/>
+                <w:sz w:val="17"/>
+              </w:rPr>
+              <w:t xml:space="preserve">  |  博客：https://security-hyacinth.blog.csdn.net</w:t>
+            </w:r>
+          </w:p>
+        </w:tc>
+        <w:tc>
+          <w:tcPr>
+            <w:tcW w:type="dxa" w:w="1701"/>
+          </w:tcPr>
+          <w:p>
+            <w:pPr>
+              <w:spacing w:before="0" w:after="0"/>
+              <w:jc w:val="center"/>
+            </w:pPr>
+          </w:p>
+          <w:tbl>
+            <w:tblPr>
+              <w:tblW w:type="auto" w:w="0"/>
+              <w:jc w:val="center"/>
+              <w:tblLook w:firstColumn="1" w:firstRow="1" w:lastColumn="0" w:lastRow="0" w:noHBand="0" w:noVBand="1" w:val="04A0"/>
+            </w:tblPr>
+            <w:tblGrid>
+              <w:gridCol w:w="1701"/>
+            </w:tblGrid>
+            <w:tr>
+              <w:trPr>
+                <w:trHeight w:val="720" w:hRule="atLeast"/>
+              </w:trPr>
+              <w:tc>
+                <w:tcPr>
+                  <w:tcW w:type="dxa" w:w="1417"/>
+                  <w:tcBorders>
+                    <w:top w:val="single" w:sz="4" w:space="0" w:color="CCCCCC"/>
+                    <w:left w:val="single" w:sz="4" w:space="0" w:color="CCCCCC"/>
+                    <w:bottom w:val="single" w:sz="4" w:space="0" w:color="CCCCCC"/>
+                    <w:right w:val="single" w:sz="4" w:space="0" w:color="CCCCCC"/>
+                  </w:tcBorders>
+                </w:tcPr>
+                <w:p>
+                  <w:pPr>
+                    <w:jc w:val="center"/>
+                  </w:pPr>
+                  <w:r>
+                    <w:rPr>
+                      <w:rFonts w:ascii="微软雅黑" w:hAnsi="微软雅黑" w:eastAsia="微软雅黑"/>
+                      <w:b w:val="0"/>
+                      <w:i w:val="0"/>
+                      <w:color w:val="AAAAAA"/>
+                      <w:sz w:val="14"/>
+                    </w:rPr>
+                    <w:t>一寸</w:t>
+                    <w:br/>
+                    <w:t>证件照</w:t>
+                    <w:br/>
+                    <w:t>位置</w:t>
+                  </w:r>
+                </w:p>
+              </w:tc>
+            </w:tr>
+          </w:tbl>
+          <w:p/>
+        </w:tc>
+      </w:tr>
+    </w:tbl>
     <w:p>
       <w:pPr>
-        <w:pStyle w:val="Heading1"/>
-        <w:jc w:val="center"/>
+        <w:spacing w:before="40" w:after="40"/>
+        <w:pBdr>
+          <w:bottom w:val="single" w:sz="6" w:space="1" w:color="1A1A2E"/>
+        </w:pBdr>
+      </w:pPr>
+    </w:p>
+    <w:p>
+      <w:pPr>
+        <w:spacing w:before="160" w:after="80"/>
+        <w:shd w:fill="1A1A2E"/>
       </w:pPr>
       <w:r>
         <w:rPr>
           <w:rFonts w:ascii="微软雅黑" w:hAnsi="微软雅黑" w:eastAsia="微软雅黑"/>
           <w:b/>
-          <w:color w:val="1A1A2E"/>
-          <w:sz w:val="52"/>
+          <w:color w:val="FFFFFF"/>
+          <w:sz w:val="23"/>
         </w:rPr>
-        <w:t>钱佳宏</w:t>
+        <w:t xml:space="preserve">  实习经历  </w:t>
       </w:r>
     </w:p>
     <w:p>
       <w:pPr>
-        <w:jc w:val="center"/>
+        <w:spacing w:before="80" w:after="0"/>
+        <w:tabs>
+          <w:tab w:val="right" w:pos="9360"/>
+        </w:tabs>
       </w:pPr>
       <w:r>
         <w:rPr>
           <w:rFonts w:ascii="微软雅黑" w:hAnsi="微软雅黑" w:eastAsia="微软雅黑"/>
-          <w:color w:val="555555"/>
-          <w:sz w:val="20"/>
+          <w:b/>
+          <w:i w:val="0"/>
+          <w:color w:val="1A1A2E"/>
+          <w:sz w:val="21"/>
         </w:rPr>
-        <w:t>信息安全 × AI 双域实践者</w:t>
+        <w:t>绿盟科技集团股份有限公司上海分公司</w:t>
+      </w:r>
+      <w:r>
+        <w:rPr>
+          <w:rFonts w:ascii="微软雅黑" w:hAnsi="微软雅黑" w:eastAsia="微软雅黑"/>
+          <w:b w:val="0"/>
+          <w:i w:val="0"/>
+          <w:color w:val="666666"/>
+          <w:sz w:val="18"/>
+        </w:rPr>
+        <w:tab/>
+        <w:t>2025.7 – 2026.7</w:t>
       </w:r>
     </w:p>
     <w:p>
       <w:pPr>
-        <w:jc w:val="center"/>
+        <w:spacing w:before="0" w:after="40"/>
       </w:pPr>
       <w:r>
         <w:rPr>
           <w:rFonts w:ascii="微软雅黑" w:hAnsi="微软雅黑" w:eastAsia="微软雅黑"/>
+          <w:b w:val="0"/>
+          <w:i/>
           <w:color w:val="444444"/>
           <w:sz w:val="19"/>
         </w:rPr>
-        <w:t>📱 19921057118    ✉️ aqfxz_zh@qq.com    📍 上海市杨浦区    🎂 2006.05    185cm     本科在读</w:t>
+        <w:t>实习安全工程师</w:t>
       </w:r>
     </w:p>
     <w:p>
       <w:pPr>
-        <w:jc w:val="center"/>
+        <w:spacing w:before="20" w:after="40"/>
+        <w:ind w:firstLine="420"/>
       </w:pPr>
-      <w:r>
-        <w:rPr>
-          <w:rFonts w:ascii="微软雅黑" w:hAnsi="微软雅黑" w:eastAsia="微软雅黑"/>
-          <w:color w:val="444444"/>
-          <w:sz w:val="19"/>
-        </w:rPr>
-        <w:t>🔗 github.com/lxcxjxhx    📝 security-hyacinth.blog.csdn.net</w:t>
-      </w:r>
-    </w:p>
-    <w:p>
-      <w:r>
-        <w:t>______________________________________________________________________</w:t>
-      </w:r>
-    </w:p>
-    <w:p>
-      <w:pPr>
-        <w:pStyle w:val="Heading1"/>
-      </w:pPr>
-      <w:r>
-        <w:rPr>
-          <w:rFonts w:ascii="微软雅黑" w:hAnsi="微软雅黑" w:eastAsia="微软雅黑"/>
-          <w:color w:val="1A1A2E"/>
-        </w:rPr>
-        <w:t>求职意向</w:t>
-      </w:r>
-    </w:p>
-    <w:p>
       <w:r>
         <w:rPr>
           <w:rFonts w:ascii="微软雅黑" w:hAnsi="微软雅黑" w:eastAsia="微软雅黑"/>
           <w:b w:val="0"/>
           <w:i w:val="0"/>
           <w:color w:val="333333"/>
+          <w:sz w:val="20"/>
         </w:rPr>
-        <w:t>信息安全工程师 / AI安全工程师 / 安全研发工程师</w:t>
+        <w:t>在绿盟科技实习期间，我负责防火墙、IDS/IPS、WAF、RSAS等安全设备的部署、策略配置及基础运维，深度参与多个金融、制造行业客户的等保合规与安全加固项目，熟练掌握主流安全产品的实施流程与故障排查方法。在此基础上，我自主研发提效工具 HOS-LS（github.com/lxcxjxhx/HOS-LS），并成功将其提交至绿盟工程交付工具平台；主动加入"安全运营–AI赋能运营专项组"，贡献文档库 BOS-NI（github.com/lxcxjxhx/BOS-NI），协助团队探索大模型在告警分析、知识检索等场景中的落地应用。上述经历体现了我对信息安全&amp;AI的主动思考、动手落地能力及工程交付意识。</w:t>
       </w:r>
     </w:p>
     <w:p>
       <w:pPr>
-        <w:pStyle w:val="Heading1"/>
+        <w:spacing w:before="160" w:after="80"/>
+        <w:shd w:fill="1A1A2E"/>
       </w:pPr>
       <w:r>
         <w:rPr>
           <w:rFonts w:ascii="微软雅黑" w:hAnsi="微软雅黑" w:eastAsia="微软雅黑"/>
-          <w:color w:val="1A1A2E"/>
+          <w:b/>
+          <w:color w:val="FFFFFF"/>
+          <w:sz w:val="23"/>
         </w:rPr>
-        <w:t>实习经历</w:t>
+        <w:t xml:space="preserve">  项目经历  </w:t>
       </w:r>
     </w:p>
     <w:p>
+      <w:pPr>
+        <w:spacing w:before="80" w:after="0"/>
+        <w:tabs>
+          <w:tab w:val="right" w:pos="9360"/>
+        </w:tabs>
+      </w:pPr>
       <w:r>
         <w:rPr>
           <w:rFonts w:ascii="微软雅黑" w:hAnsi="微软雅黑" w:eastAsia="微软雅黑"/>
           <w:b/>
+          <w:i w:val="0"/>
           <w:color w:val="1A1A2E"/>
-          <w:sz w:val="23"/>
+          <w:sz w:val="21"/>
         </w:rPr>
-        <w:t>绿盟科技集团股份有限公司上海分公司</w:t>
+        <w:t>中美创客国奖项目"安全风信子"信息安全攻防与技术交流平台</w:t>
       </w:r>
       <w:r>
         <w:rPr>
           <w:rFonts w:ascii="微软雅黑" w:hAnsi="微软雅黑" w:eastAsia="微软雅黑"/>
+          <w:b w:val="0"/>
+          <w:i w:val="0"/>
           <w:color w:val="666666"/>
-          <w:sz w:val="19"/>
+          <w:sz w:val="18"/>
         </w:rPr>
-        <w:t xml:space="preserve">          2025.07 – 2026.07</w:t>
-      </w:r>
-    </w:p>
-    <w:p>
-      <w:r>
-        <w:rPr>
-          <w:rFonts w:ascii="微软雅黑" w:hAnsi="微软雅黑" w:eastAsia="微软雅黑"/>
-          <w:i/>
-          <w:color w:val="555555"/>
-          <w:sz w:val="20"/>
-        </w:rPr>
-        <w:t>实习安全工程师</w:t>
+        <w:tab/>
+        <w:t>2024.9 – 2025.6</w:t>
       </w:r>
     </w:p>
     <w:p>
       <w:pPr>
-        <w:pStyle w:val="ListBullet"/>
-        <w:spacing w:after="20" w:before="0"/>
+        <w:spacing w:before="0" w:after="40"/>
       </w:pPr>
       <w:r>
         <w:rPr>
           <w:rFonts w:ascii="微软雅黑" w:hAnsi="微软雅黑" w:eastAsia="微软雅黑"/>
+          <w:b w:val="0"/>
+          <w:i/>
+          <w:color w:val="444444"/>
+          <w:sz w:val="19"/>
+        </w:rPr>
+        <w:t>负责人 &amp; 软件开发</w:t>
+      </w:r>
+    </w:p>
+    <w:p>
+      <w:pPr>
+        <w:spacing w:before="20" w:after="40"/>
+        <w:ind w:firstLine="420"/>
+      </w:pPr>
+      <w:r>
+        <w:rPr>
+          <w:rFonts w:ascii="微软雅黑" w:hAnsi="微软雅黑" w:eastAsia="微软雅黑"/>
+          <w:b w:val="0"/>
+          <w:i w:val="0"/>
+          <w:color w:val="333333"/>
+          <w:sz w:val="20"/>
+        </w:rPr>
+        <w:t>带领六人团队联合开发"安全风信子"AI+信息安全攻防与学习平台，聚焦终端威胁检测、AI辅助漏洞分析、命令行智能建议与日志审计学习等核心功能，适配多终端与实训场景。主导平台安全体系搭建，负责渗透测试辅助模块、指令行为分析、攻击日志归类与可视化响应等核心环节，实现对异常行为的快速识别与反馈。结合Qwen等大模型构建AI安全对抗引擎，融合知识图谱与强化学习技术，提升平台在漏洞挖掘、溯源分析等方向的能力。项目已获中美创客分赛道国奖，软件著作权，正在申请专利，致力于打造面向实训场景的智能化攻防演练平台。</w:t>
+      </w:r>
+    </w:p>
+    <w:p>
+      <w:pPr>
+        <w:spacing w:before="80" w:after="0"/>
+        <w:tabs>
+          <w:tab w:val="right" w:pos="9360"/>
+        </w:tabs>
+      </w:pPr>
+      <w:r>
+        <w:rPr>
+          <w:rFonts w:ascii="微软雅黑" w:hAnsi="微软雅黑" w:eastAsia="微软雅黑"/>
+          <w:b/>
+          <w:i w:val="0"/>
+          <w:color w:val="1A1A2E"/>
           <w:sz w:val="21"/>
         </w:rPr>
-        <w:t xml:space="preserve">• </w:t>
+        <w:t>智医语伴机器人战队</w:t>
       </w:r>
       <w:r>
         <w:rPr>
           <w:rFonts w:ascii="微软雅黑" w:hAnsi="微软雅黑" w:eastAsia="微软雅黑"/>
-          <w:sz w:val="21"/>
+          <w:b w:val="0"/>
+          <w:i w:val="0"/>
+          <w:color w:val="666666"/>
+          <w:sz w:val="18"/>
         </w:rPr>
-        <w:t>安全设备运维：负责防火墙、IDS/IPS、WAF、RSAS等安全设备的部署、策略配置及基础运维，服务金融、制造行业客户</w:t>
+        <w:tab/>
+        <w:t>2023.9 – 2024.6</w:t>
       </w:r>
     </w:p>
     <w:p>
       <w:pPr>
-        <w:pStyle w:val="ListBullet"/>
-        <w:spacing w:after="20" w:before="0"/>
+        <w:spacing w:before="0" w:after="40"/>
       </w:pPr>
       <w:r>
         <w:rPr>
           <w:rFonts w:ascii="微软雅黑" w:hAnsi="微软雅黑" w:eastAsia="微软雅黑"/>
-          <w:sz w:val="21"/>
+          <w:b w:val="0"/>
+          <w:i/>
+          <w:color w:val="444444"/>
+          <w:sz w:val="19"/>
         </w:rPr>
-        <w:t xml:space="preserve">• </w:t>
+        <w:t>队员 &amp; 人工智能应用开发</w:t>
+      </w:r>
+    </w:p>
+    <w:p>
+      <w:pPr>
+        <w:spacing w:before="20" w:after="40"/>
+        <w:ind w:firstLine="420"/>
+      </w:pPr>
+      <w:r>
+        <w:rPr>
+          <w:rFonts w:ascii="微软雅黑" w:hAnsi="微软雅黑" w:eastAsia="微软雅黑"/>
+          <w:b w:val="0"/>
+          <w:i w:val="0"/>
+          <w:color w:val="333333"/>
+          <w:sz w:val="20"/>
+        </w:rPr>
+        <w:t>参与英特尔人工智能创新应用大赛，依托"AI PC"平台开发医疗辅助项目"智医语伴机器人"，旨在提升基层诊疗效率与医患沟通体验。负责项目中语音数据隐私保护机制设计，主导通信链路加密、敏感内容识别、日志合规审计与安全传输策略实施，确保医疗场景下的数据安全与系统稳定性。同时参与语音识别优化与用户交互流程设计，提升系统准确率与使用体验。项目成功入围创新创业专项赛（GBAC240303106392），获得主办方高度认可，体现AI在医疗数据安全落地中的可行性。</w:t>
+      </w:r>
+    </w:p>
+    <w:p>
+      <w:pPr>
+        <w:spacing w:before="160" w:after="80"/>
+        <w:shd w:fill="1A1A2E"/>
+      </w:pPr>
+      <w:r>
+        <w:rPr>
+          <w:rFonts w:ascii="微软雅黑" w:hAnsi="微软雅黑" w:eastAsia="微软雅黑"/>
+          <w:b/>
+          <w:color w:val="FFFFFF"/>
+          <w:sz w:val="23"/>
+        </w:rPr>
+        <w:t xml:space="preserve">  技能 &amp; 证书  </w:t>
+      </w:r>
+    </w:p>
+    <w:p>
+      <w:pPr>
+        <w:spacing w:before="0" w:after="20"/>
+      </w:pPr>
+      <w:r>
+        <w:rPr>
+          <w:rFonts w:ascii="微软雅黑" w:hAnsi="微软雅黑" w:eastAsia="微软雅黑"/>
+          <w:b/>
+          <w:i w:val="0"/>
+          <w:color w:val="1A1A2E"/>
+          <w:sz w:val="20"/>
+        </w:rPr>
+        <w:t>语言技能：</w:t>
       </w:r>
       <w:r>
         <w:rPr>
           <w:rFonts w:ascii="微软雅黑" w:hAnsi="微软雅黑" w:eastAsia="微软雅黑"/>
-          <w:sz w:val="21"/>
+          <w:b w:val="0"/>
+          <w:i w:val="0"/>
+          <w:color w:val="333333"/>
+          <w:sz w:val="20"/>
         </w:rPr>
-        <w:t>等保合规项目：深度参与多个等保合规与安全加固项目，熟练掌握主流安全产品的实施流程与故障排查</w:t>
+        <w:t>英语CET6（411），普通话二级乙等</w:t>
       </w:r>
     </w:p>
     <w:p>
       <w:pPr>
-        <w:pStyle w:val="ListBullet"/>
-        <w:spacing w:after="20" w:before="0"/>
+        <w:spacing w:before="0" w:after="20"/>
       </w:pPr>
       <w:r>
         <w:rPr>
           <w:rFonts w:ascii="微软雅黑" w:hAnsi="微软雅黑" w:eastAsia="微软雅黑"/>
-          <w:sz w:val="21"/>
+          <w:b/>
+          <w:i w:val="0"/>
+          <w:color w:val="1A1A2E"/>
+          <w:sz w:val="20"/>
         </w:rPr>
-        <w:t xml:space="preserve">• </w:t>
+        <w:t>专业技能：</w:t>
       </w:r>
       <w:r>
         <w:rPr>
           <w:rFonts w:ascii="微软雅黑" w:hAnsi="微软雅黑" w:eastAsia="微软雅黑"/>
-          <w:sz w:val="21"/>
+          <w:b w:val="0"/>
+          <w:i w:val="0"/>
+          <w:color w:val="333333"/>
+          <w:sz w:val="20"/>
         </w:rPr>
-        <w:t>自研提效工具：自主研发 HOS-LS 代码安全分析系统，成功提交至绿盟工程交付工具平台</w:t>
+        <w:t>熟悉Python及PyTorch框架，具备大模型（RAG、代码生成）训练调优、模型压缩蒸馏实战经验。同时掌握强化学习、AI Agent开发应用方法，拥有系统安全分析与漏洞挖掘能力，熟悉MCP、skills、langchain等前沿技术架构。</w:t>
       </w:r>
     </w:p>
     <w:p>
       <w:pPr>
-        <w:pStyle w:val="ListBullet"/>
-        <w:spacing w:after="20" w:before="0"/>
+        <w:spacing w:before="0" w:after="20"/>
       </w:pPr>
       <w:r>
         <w:rPr>
           <w:rFonts w:ascii="微软雅黑" w:hAnsi="微软雅黑" w:eastAsia="微软雅黑"/>
-          <w:sz w:val="21"/>
+          <w:b/>
+          <w:i w:val="0"/>
+          <w:color w:val="1A1A2E"/>
+          <w:sz w:val="20"/>
         </w:rPr>
-        <w:t xml:space="preserve">• </w:t>
+        <w:t>办公技能：</w:t>
       </w:r>
       <w:r>
         <w:rPr>
           <w:rFonts w:ascii="微软雅黑" w:hAnsi="微软雅黑" w:eastAsia="微软雅黑"/>
-          <w:sz w:val="21"/>
+          <w:b w:val="0"/>
+          <w:i w:val="0"/>
+          <w:color w:val="333333"/>
+          <w:sz w:val="20"/>
         </w:rPr>
-        <w:t>AI安全运营：加入"安全运营–AI赋能运营专项组"，探索大模型在告警分析、知识检索等场景的落地应用</w:t>
+        <w:t>EFG创业训练营结业证书（第75期），计算机一级证书，C2驾照</w:t>
       </w:r>
     </w:p>
     <w:p>
       <w:pPr>
-        <w:pStyle w:val="Heading1"/>
+        <w:spacing w:before="160" w:after="80"/>
+        <w:shd w:fill="1A1A2E"/>
       </w:pPr>
       <w:r>
         <w:rPr>
           <w:rFonts w:ascii="微软雅黑" w:hAnsi="微软雅黑" w:eastAsia="微软雅黑"/>
-          <w:color w:val="1A1A2E"/>
-        </w:rPr>
-        <w:t>项目经历</w:t>
-      </w:r>
-    </w:p>
-    <w:p>
-      <w:r>
-        <w:rPr>
-          <w:rFonts w:ascii="微软雅黑" w:hAnsi="微软雅黑" w:eastAsia="微软雅黑"/>
           <w:b/>
-          <w:color w:val="1A1A2E"/>
+          <w:color w:val="FFFFFF"/>
           <w:sz w:val="23"/>
         </w:rPr>
-        <w:t>安全风信子 — 信息安全攻防与技术交流平台</w:t>
-      </w:r>
-      <w:r>
-        <w:rPr>
-          <w:rFonts w:ascii="微软雅黑" w:hAnsi="微软雅黑" w:eastAsia="微软雅黑"/>
-          <w:color w:val="666666"/>
-          <w:sz w:val="19"/>
-        </w:rPr>
-        <w:t xml:space="preserve">          2024.09 – 2025.06</w:t>
-      </w:r>
-    </w:p>
-    <w:p>
-      <w:r>
-        <w:rPr>
-          <w:rFonts w:ascii="微软雅黑" w:hAnsi="微软雅黑" w:eastAsia="微软雅黑"/>
-          <w:i/>
-          <w:color w:val="555555"/>
-          <w:sz w:val="20"/>
-        </w:rPr>
-        <w:t>项目负责人 · 中美青年创客大赛特等奖</w:t>
+        <w:t xml:space="preserve">  自我介绍  </w:t>
       </w:r>
     </w:p>
     <w:p>
       <w:pPr>
-        <w:pStyle w:val="ListBullet"/>
-        <w:spacing w:after="20" w:before="0"/>
+        <w:spacing w:before="40"/>
+        <w:ind w:firstLine="420"/>
       </w:pPr>
       <w:r>
         <w:rPr>
           <w:rFonts w:ascii="微软雅黑" w:hAnsi="微软雅黑" w:eastAsia="微软雅黑"/>
-          <w:sz w:val="21"/>
+          <w:b w:val="0"/>
+          <w:i w:val="0"/>
+          <w:color w:val="333333"/>
+          <w:sz w:val="20"/>
         </w:rPr>
-        <w:t xml:space="preserve">• </w:t>
-      </w:r>
-      <w:r>
-        <w:rPr>
-          <w:rFonts w:ascii="微软雅黑" w:hAnsi="微软雅黑" w:eastAsia="微软雅黑"/>
-          <w:sz w:val="21"/>
-        </w:rPr>
-        <w:t>带领6人团队开发AI+信息安全攻防平台，聚焦终端威胁检测、AI辅助漏洞分析、命令行智能建议与日志审计</w:t>
+        <w:t>具备扎实的AI技术功底，熟悉自然语言处理（NLP）、计算机视觉及全栈算法开发，大模型应用、数据结构优化与信息安全体系设计。擅长将技术与运营需求深度融合，快速学习并掌握前沿技术，解决复杂问题。拥有出色的团队领导与协作能力，能高效带领团队完成跨领域项目，推动技术落地与创新。逻辑清晰，注重细节，善于通过数据驱动决策，优化系统性能与用户体验。热衷于技术探索与分享，适应快节奏环境，涵盖计算机视觉、NLP、全栈算法及技术运营。</w:t>
       </w:r>
     </w:p>
     <w:p>
       <w:pPr>
-        <w:pStyle w:val="ListBullet"/>
-        <w:spacing w:after="20" w:before="0"/>
-      </w:pPr>
-      <w:r>
-        <w:rPr>
-          <w:rFonts w:ascii="微软雅黑" w:hAnsi="微软雅黑" w:eastAsia="微软雅黑"/>
-          <w:sz w:val="21"/>
-        </w:rPr>
-        <w:t xml:space="preserve">• </w:t>
-      </w:r>
-      <w:r>
-        <w:rPr>
-          <w:rFonts w:ascii="微软雅黑" w:hAnsi="微软雅黑" w:eastAsia="微软雅黑"/>
-          <w:sz w:val="21"/>
-        </w:rPr>
-        <w:t>主导平台安全体系搭建，负责渗透测试辅助模块、指令行为分析、攻击日志归类与可视化响应</w:t>
-      </w:r>
-    </w:p>
-    <w:p>
-      <w:pPr>
-        <w:pStyle w:val="ListBullet"/>
-        <w:spacing w:after="20" w:before="0"/>
-      </w:pPr>
-      <w:r>
-        <w:rPr>
-          <w:rFonts w:ascii="微软雅黑" w:hAnsi="微软雅黑" w:eastAsia="微软雅黑"/>
-          <w:sz w:val="21"/>
-        </w:rPr>
-        <w:t xml:space="preserve">• </w:t>
-      </w:r>
-      <w:r>
-        <w:rPr>
-          <w:rFonts w:ascii="微软雅黑" w:hAnsi="微软雅黑" w:eastAsia="微软雅黑"/>
-          <w:sz w:val="21"/>
-        </w:rPr>
-        <w:t>结合Qwen大模型构建AI安全对抗引擎，融合知识图谱与强化学习技术</w:t>
-      </w:r>
-    </w:p>
-    <w:p>
-      <w:pPr>
-        <w:pStyle w:val="ListBullet"/>
-        <w:spacing w:after="20" w:before="0"/>
-      </w:pPr>
-      <w:r>
-        <w:rPr>
-          <w:rFonts w:ascii="微软雅黑" w:hAnsi="微软雅黑" w:eastAsia="微软雅黑"/>
-          <w:sz w:val="21"/>
-        </w:rPr>
-        <w:t xml:space="preserve">• </w:t>
-      </w:r>
-      <w:r>
-        <w:rPr>
-          <w:rFonts w:ascii="微软雅黑" w:hAnsi="微软雅黑" w:eastAsia="微软雅黑"/>
-          <w:sz w:val="21"/>
-        </w:rPr>
-        <w:t>成果：中美创客分赛道国奖、软件著作权、专利申请中</w:t>
-      </w:r>
-    </w:p>
-    <w:p>
-      <w:r>
-        <w:rPr>
-          <w:rFonts w:ascii="微软雅黑" w:hAnsi="微软雅黑" w:eastAsia="微软雅黑"/>
-          <w:b/>
-          <w:color w:val="1A1A2E"/>
-          <w:sz w:val="23"/>
-        </w:rPr>
-        <w:t>智医语伴机器人 — 医疗AI辅助项目</w:t>
-      </w:r>
-      <w:r>
-        <w:rPr>
-          <w:rFonts w:ascii="微软雅黑" w:hAnsi="微软雅黑" w:eastAsia="微软雅黑"/>
-          <w:color w:val="666666"/>
-          <w:sz w:val="19"/>
-        </w:rPr>
-        <w:t xml:space="preserve">          2023.09 – 2024.06</w:t>
-      </w:r>
-    </w:p>
-    <w:p>
-      <w:r>
-        <w:rPr>
-          <w:rFonts w:ascii="微软雅黑" w:hAnsi="微软雅黑" w:eastAsia="微软雅黑"/>
-          <w:i/>
-          <w:color w:val="555555"/>
-          <w:sz w:val="20"/>
-        </w:rPr>
-        <w:t>核心开发 · 英特尔AI创新应用大赛</w:t>
-      </w:r>
-    </w:p>
-    <w:p>
-      <w:pPr>
-        <w:pStyle w:val="ListBullet"/>
-        <w:spacing w:after="20" w:before="0"/>
-      </w:pPr>
-      <w:r>
-        <w:rPr>
-          <w:rFonts w:ascii="微软雅黑" w:hAnsi="微软雅黑" w:eastAsia="微软雅黑"/>
-          <w:sz w:val="21"/>
-        </w:rPr>
-        <w:t xml:space="preserve">• </w:t>
-      </w:r>
-      <w:r>
-        <w:rPr>
-          <w:rFonts w:ascii="微软雅黑" w:hAnsi="微软雅黑" w:eastAsia="微软雅黑"/>
-          <w:sz w:val="21"/>
-        </w:rPr>
-        <w:t>基于"AI PC"平台开发医疗辅助项目，提升基层诊疗效率与医患沟通体验</w:t>
-      </w:r>
-    </w:p>
-    <w:p>
-      <w:pPr>
-        <w:pStyle w:val="ListBullet"/>
-        <w:spacing w:after="20" w:before="0"/>
-      </w:pPr>
-      <w:r>
-        <w:rPr>
-          <w:rFonts w:ascii="微软雅黑" w:hAnsi="微软雅黑" w:eastAsia="微软雅黑"/>
-          <w:sz w:val="21"/>
-        </w:rPr>
-        <w:t xml:space="preserve">• </w:t>
-      </w:r>
-      <w:r>
-        <w:rPr>
-          <w:rFonts w:ascii="微软雅黑" w:hAnsi="微软雅黑" w:eastAsia="微软雅黑"/>
-          <w:sz w:val="21"/>
-        </w:rPr>
-        <w:t>负责语音数据隐私保护机制设计，主导通信链路加密、敏感内容识别、日志合规审计与安全传输策略</w:t>
-      </w:r>
-    </w:p>
-    <w:p>
-      <w:pPr>
-        <w:pStyle w:val="ListBullet"/>
-        <w:spacing w:after="20" w:before="0"/>
-      </w:pPr>
-      <w:r>
-        <w:rPr>
-          <w:rFonts w:ascii="微软雅黑" w:hAnsi="微软雅黑" w:eastAsia="微软雅黑"/>
-          <w:sz w:val="21"/>
-        </w:rPr>
-        <w:t xml:space="preserve">• </w:t>
-      </w:r>
-      <w:r>
-        <w:rPr>
-          <w:rFonts w:ascii="微软雅黑" w:hAnsi="微软雅黑" w:eastAsia="微软雅黑"/>
-          <w:sz w:val="21"/>
-        </w:rPr>
-        <w:t>参与语音识别优化与用户交互流程设计</w:t>
-      </w:r>
-    </w:p>
-    <w:p>
-      <w:pPr>
-        <w:pStyle w:val="ListBullet"/>
-        <w:spacing w:after="20" w:before="0"/>
-      </w:pPr>
-      <w:r>
-        <w:rPr>
-          <w:rFonts w:ascii="微软雅黑" w:hAnsi="微软雅黑" w:eastAsia="微软雅黑"/>
-          <w:sz w:val="21"/>
-        </w:rPr>
-        <w:t xml:space="preserve">• </w:t>
-      </w:r>
-      <w:r>
-        <w:rPr>
-          <w:rFonts w:ascii="微软雅黑" w:hAnsi="微软雅黑" w:eastAsia="微软雅黑"/>
-          <w:sz w:val="21"/>
-        </w:rPr>
-        <w:t>成果：入围创新创业专项赛（GBAC240303106392）</w:t>
-      </w:r>
-    </w:p>
-    <w:p>
-      <w:r>
-        <w:rPr>
-          <w:rFonts w:ascii="微软雅黑" w:hAnsi="微软雅黑" w:eastAsia="微软雅黑"/>
-          <w:b/>
-          <w:color w:val="1A1A2E"/>
-          <w:sz w:val="23"/>
-        </w:rPr>
-        <w:t>HOS-LS — AI驱动的代码安全分析与攻击链推理系统</w:t>
-      </w:r>
-      <w:r>
-        <w:rPr>
-          <w:rFonts w:ascii="微软雅黑" w:hAnsi="微软雅黑" w:eastAsia="微软雅黑"/>
-          <w:color w:val="666666"/>
-          <w:sz w:val="19"/>
-        </w:rPr>
-        <w:t xml:space="preserve">          2025</w:t>
-      </w:r>
-    </w:p>
-    <w:p>
-      <w:r>
-        <w:rPr>
-          <w:rFonts w:ascii="微软雅黑" w:hAnsi="微软雅黑" w:eastAsia="微软雅黑"/>
-          <w:i/>
-          <w:color w:val="555555"/>
-          <w:sz w:val="20"/>
-        </w:rPr>
-        <w:t>独立开发</w:t>
-      </w:r>
-    </w:p>
-    <w:p>
-      <w:pPr>
-        <w:pStyle w:val="ListBullet"/>
-        <w:spacing w:after="20" w:before="0"/>
-      </w:pPr>
-      <w:r>
-        <w:rPr>
-          <w:rFonts w:ascii="微软雅黑" w:hAnsi="微软雅黑" w:eastAsia="微软雅黑"/>
-          <w:sz w:val="21"/>
-        </w:rPr>
-        <w:t xml:space="preserve">• </w:t>
-      </w:r>
-      <w:r>
-        <w:rPr>
-          <w:rFonts w:ascii="微软雅黑" w:hAnsi="微软雅黑" w:eastAsia="微软雅黑"/>
-          <w:sz w:val="21"/>
-        </w:rPr>
-        <w:t>基于AI语义理解的代码安全分析引擎，超越传统正则匹配</w:t>
-      </w:r>
-    </w:p>
-    <w:p>
-      <w:pPr>
-        <w:pStyle w:val="ListBullet"/>
-        <w:spacing w:after="20" w:before="0"/>
-      </w:pPr>
-      <w:r>
-        <w:rPr>
-          <w:rFonts w:ascii="微软雅黑" w:hAnsi="微软雅黑" w:eastAsia="微软雅黑"/>
-          <w:sz w:val="21"/>
-        </w:rPr>
-        <w:t xml:space="preserve">• </w:t>
-      </w:r>
-      <w:r>
-        <w:rPr>
-          <w:rFonts w:ascii="微软雅黑" w:hAnsi="微软雅黑" w:eastAsia="微软雅黑"/>
-          <w:sz w:val="21"/>
-        </w:rPr>
-        <w:t>实现端到端攻击链推理与可视化，支持多Agent协同分析与自动化漏洞利用代码生成</w:t>
-      </w:r>
-    </w:p>
-    <w:p>
-      <w:pPr>
-        <w:pStyle w:val="ListBullet"/>
-        <w:spacing w:after="20" w:before="0"/>
-      </w:pPr>
-      <w:r>
-        <w:rPr>
-          <w:rFonts w:ascii="微软雅黑" w:hAnsi="微软雅黑" w:eastAsia="微软雅黑"/>
-          <w:sz w:val="21"/>
-        </w:rPr>
-        <w:t xml:space="preserve">• </w:t>
-      </w:r>
-      <w:r>
-        <w:rPr>
-          <w:rFonts w:ascii="微软雅黑" w:hAnsi="微软雅黑" w:eastAsia="微软雅黑"/>
-          <w:sz w:val="21"/>
-        </w:rPr>
-        <w:t>技术栈：Python, PyTorch, Multi-Agent AI, RAG, LangChain</w:t>
-      </w:r>
-    </w:p>
-    <w:p>
-      <w:pPr>
-        <w:pStyle w:val="Heading1"/>
-      </w:pPr>
-      <w:r>
-        <w:rPr>
-          <w:rFonts w:ascii="微软雅黑" w:hAnsi="微软雅黑" w:eastAsia="微软雅黑"/>
-          <w:color w:val="1A1A2E"/>
-        </w:rPr>
-        <w:t>专业技能</w:t>
-      </w:r>
-    </w:p>
-    <w:p>
-      <w:r>
-        <w:rPr>
-          <w:rFonts w:ascii="微软雅黑" w:hAnsi="微软雅黑" w:eastAsia="微软雅黑"/>
-          <w:b/>
-          <w:color w:val="1A1A2E"/>
-          <w:sz w:val="21"/>
-        </w:rPr>
-        <w:t>编程语言：</w:t>
-      </w:r>
-      <w:r>
-        <w:rPr>
-          <w:rFonts w:ascii="微软雅黑" w:hAnsi="微软雅黑" w:eastAsia="微软雅黑"/>
-          <w:color w:val="333333"/>
-          <w:sz w:val="21"/>
-        </w:rPr>
-        <w:t>Python（精通）、TypeScript、C/C++、Shell</w:t>
-      </w:r>
-    </w:p>
-    <w:p>
-      <w:r>
-        <w:rPr>
-          <w:rFonts w:ascii="微软雅黑" w:hAnsi="微软雅黑" w:eastAsia="微软雅黑"/>
-          <w:b/>
-          <w:color w:val="1A1A2E"/>
-          <w:sz w:val="21"/>
-        </w:rPr>
-        <w:t>AI与大模型：</w:t>
-      </w:r>
-      <w:r>
-        <w:rPr>
-          <w:rFonts w:ascii="微软雅黑" w:hAnsi="微软雅黑" w:eastAsia="微软雅黑"/>
-          <w:color w:val="333333"/>
-          <w:sz w:val="21"/>
-        </w:rPr>
-        <w:t>PyTorch、RAG、模型微调与压缩蒸馏、Multi-Agent系统、Prompt Engineering、MCP工程、vLLM推理引擎、LangChain</w:t>
-      </w:r>
-    </w:p>
-    <w:p>
-      <w:r>
-        <w:rPr>
-          <w:rFonts w:ascii="微软雅黑" w:hAnsi="微软雅黑" w:eastAsia="微软雅黑"/>
-          <w:b/>
-          <w:color w:val="1A1A2E"/>
-          <w:sz w:val="21"/>
-        </w:rPr>
-        <w:t>信息安全：</w:t>
-      </w:r>
-      <w:r>
-        <w:rPr>
-          <w:rFonts w:ascii="微软雅黑" w:hAnsi="微软雅黑" w:eastAsia="微软雅黑"/>
-          <w:color w:val="333333"/>
-          <w:sz w:val="21"/>
-        </w:rPr>
-        <w:t>系统安全分析、漏洞挖掘、攻击链推理、CTF实战（国赛级）、红队自动化工具、等保合规、安全设备部署与运维</w:t>
-      </w:r>
-    </w:p>
-    <w:p>
-      <w:r>
-        <w:rPr>
-          <w:rFonts w:ascii="微软雅黑" w:hAnsi="微软雅黑" w:eastAsia="微软雅黑"/>
-          <w:b/>
-          <w:color w:val="1A1A2E"/>
-          <w:sz w:val="21"/>
-        </w:rPr>
-        <w:t>全栈开发：</w:t>
-      </w:r>
-      <w:r>
-        <w:rPr>
-          <w:rFonts w:ascii="微软雅黑" w:hAnsi="微软雅黑" w:eastAsia="微软雅黑"/>
-          <w:color w:val="333333"/>
-          <w:sz w:val="21"/>
-        </w:rPr>
-        <w:t>React、Taro跨端、FastAPI、Node.js、Docker、GitHub Actions</w:t>
-      </w:r>
-    </w:p>
-    <w:p>
-      <w:r>
-        <w:rPr>
-          <w:rFonts w:ascii="微软雅黑" w:hAnsi="微软雅黑" w:eastAsia="微软雅黑"/>
-          <w:b/>
-          <w:color w:val="1A1A2E"/>
-          <w:sz w:val="21"/>
-        </w:rPr>
-        <w:t>语言能力：</w:t>
-      </w:r>
-      <w:r>
-        <w:rPr>
-          <w:rFonts w:ascii="微软雅黑" w:hAnsi="微软雅黑" w:eastAsia="微软雅黑"/>
-          <w:color w:val="333333"/>
-          <w:sz w:val="21"/>
-        </w:rPr>
-        <w:t>英语 CET-6（411分）、普通话二级乙等</w:t>
-      </w:r>
-    </w:p>
-    <w:p>
-      <w:pPr>
-        <w:pStyle w:val="Heading1"/>
-      </w:pPr>
-      <w:r>
-        <w:rPr>
-          <w:rFonts w:ascii="微软雅黑" w:hAnsi="微软雅黑" w:eastAsia="微软雅黑"/>
-          <w:color w:val="1A1A2E"/>
-        </w:rPr>
-        <w:t>荣誉奖项</w:t>
-      </w:r>
-    </w:p>
-    <w:p>
-      <w:r>
-        <w:rPr>
-          <w:rFonts w:ascii="微软雅黑" w:hAnsi="微软雅黑" w:eastAsia="微软雅黑"/>
-          <w:b/>
-          <w:color w:val="1A1A2E"/>
-          <w:sz w:val="21"/>
-        </w:rPr>
-        <w:t xml:space="preserve">中美青年创客大赛特等奖    </w:t>
-      </w:r>
-      <w:r>
-        <w:rPr>
-          <w:rFonts w:ascii="微软雅黑" w:hAnsi="微软雅黑" w:eastAsia="微软雅黑"/>
-          <w:color w:val="555555"/>
-          <w:sz w:val="21"/>
-        </w:rPr>
-        <w:t>2025 · 国家级</w:t>
-      </w:r>
-    </w:p>
-    <w:p>
-      <w:r>
-        <w:rPr>
-          <w:rFonts w:ascii="微软雅黑" w:hAnsi="微软雅黑" w:eastAsia="微软雅黑"/>
-          <w:b/>
-          <w:color w:val="1A1A2E"/>
-          <w:sz w:val="21"/>
-        </w:rPr>
-        <w:t xml:space="preserve">英特尔AI创新应用大赛入围    </w:t>
-      </w:r>
-      <w:r>
-        <w:rPr>
-          <w:rFonts w:ascii="微软雅黑" w:hAnsi="微软雅黑" w:eastAsia="微软雅黑"/>
-          <w:color w:val="555555"/>
-          <w:sz w:val="21"/>
-        </w:rPr>
-        <w:t>2024 · 创新创业专项赛</w:t>
-      </w:r>
-    </w:p>
-    <w:p>
-      <w:r>
-        <w:rPr>
-          <w:rFonts w:ascii="微软雅黑" w:hAnsi="微软雅黑" w:eastAsia="微软雅黑"/>
-          <w:b/>
-          <w:color w:val="1A1A2E"/>
-          <w:sz w:val="21"/>
-        </w:rPr>
-        <w:t xml:space="preserve">阿里云专家博主    </w:t>
-      </w:r>
-      <w:r>
-        <w:rPr>
-          <w:rFonts w:ascii="微软雅黑" w:hAnsi="微软雅黑" w:eastAsia="微软雅黑"/>
-          <w:color w:val="555555"/>
-          <w:sz w:val="21"/>
-        </w:rPr>
-        <w:t>CSDN 1,467篇原创，1.2M+访问</w:t>
-      </w:r>
-    </w:p>
-    <w:p>
-      <w:r>
-        <w:rPr>
-          <w:rFonts w:ascii="微软雅黑" w:hAnsi="微软雅黑" w:eastAsia="微软雅黑"/>
-          <w:b/>
-          <w:color w:val="1A1A2E"/>
-          <w:sz w:val="21"/>
-        </w:rPr>
-        <w:t xml:space="preserve">华为云专家博主 / 腾讯云创作之星    </w:t>
-      </w:r>
-      <w:r>
-        <w:rPr>
-          <w:rFonts w:ascii="微软雅黑" w:hAnsi="微软雅黑" w:eastAsia="微软雅黑"/>
-          <w:color w:val="555555"/>
-          <w:sz w:val="21"/>
-        </w:rPr>
-        <w:t>技术内容创作者</w:t>
-      </w:r>
-    </w:p>
-    <w:p>
-      <w:r>
-        <w:rPr>
-          <w:rFonts w:ascii="微软雅黑" w:hAnsi="微软雅黑" w:eastAsia="微软雅黑"/>
-          <w:b/>
-          <w:color w:val="1A1A2E"/>
-          <w:sz w:val="21"/>
-        </w:rPr>
-        <w:t xml:space="preserve">EFG创业训练营结业    </w:t>
-      </w:r>
-      <w:r>
-        <w:rPr>
-          <w:rFonts w:ascii="微软雅黑" w:hAnsi="微软雅黑" w:eastAsia="微软雅黑"/>
-          <w:color w:val="555555"/>
-          <w:sz w:val="21"/>
-        </w:rPr>
-        <w:t>第75期</w:t>
-      </w:r>
-    </w:p>
-    <w:p>
-      <w:pPr>
-        <w:pStyle w:val="Heading1"/>
-      </w:pPr>
-      <w:r>
-        <w:rPr>
-          <w:rFonts w:ascii="微软雅黑" w:hAnsi="微软雅黑" w:eastAsia="微软雅黑"/>
-          <w:color w:val="1A1A2E"/>
-        </w:rPr>
-        <w:t>开源贡献 &amp; 技术分享</w:t>
-      </w:r>
-    </w:p>
-    <w:p>
-      <w:pPr>
-        <w:pStyle w:val="ListBullet"/>
-        <w:spacing w:after="20" w:before="0"/>
-      </w:pPr>
-      <w:r>
-        <w:rPr>
-          <w:rFonts w:ascii="微软雅黑" w:hAnsi="微软雅黑" w:eastAsia="微软雅黑"/>
-          <w:sz w:val="21"/>
-        </w:rPr>
-        <w:t xml:space="preserve">• </w:t>
-      </w:r>
-      <w:r>
-        <w:rPr>
-          <w:rFonts w:ascii="微软雅黑" w:hAnsi="微软雅黑" w:eastAsia="微软雅黑"/>
-          <w:sz w:val="21"/>
-        </w:rPr>
-        <w:t>GitHub：807+ 年度贡献，7个PyPI开源包，Hugging Face微调模型</w:t>
-      </w:r>
-    </w:p>
-    <w:p>
-      <w:pPr>
-        <w:pStyle w:val="ListBullet"/>
-        <w:spacing w:after="20" w:before="0"/>
-      </w:pPr>
-      <w:r>
-        <w:rPr>
-          <w:rFonts w:ascii="微软雅黑" w:hAnsi="微软雅黑" w:eastAsia="微软雅黑"/>
-          <w:sz w:val="21"/>
-        </w:rPr>
-        <w:t xml:space="preserve">• </w:t>
-      </w:r>
-      <w:r>
-        <w:rPr>
-          <w:rFonts w:ascii="微软雅黑" w:hAnsi="微软雅黑" w:eastAsia="微软雅黑"/>
-          <w:sz w:val="21"/>
-        </w:rPr>
-        <w:t>技术博客：CSDN 1,467篇原创，12+系统化专栏（vLLM实战、MCP工程、CTF攻防等）</w:t>
-      </w:r>
-    </w:p>
-    <w:p>
-      <w:pPr>
-        <w:pStyle w:val="ListBullet"/>
-        <w:spacing w:after="20" w:before="0"/>
-      </w:pPr>
-      <w:r>
-        <w:rPr>
-          <w:rFonts w:ascii="微软雅黑" w:hAnsi="微软雅黑" w:eastAsia="微软雅黑"/>
-          <w:sz w:val="21"/>
-        </w:rPr>
-        <w:t xml:space="preserve">• </w:t>
-      </w:r>
-      <w:r>
-        <w:rPr>
-          <w:rFonts w:ascii="微软雅黑" w:hAnsi="微软雅黑" w:eastAsia="微软雅黑"/>
-          <w:sz w:val="21"/>
-        </w:rPr>
-        <w:t>PyPI：security_hyacinth 安全工具包系列</w:t>
-      </w:r>
-    </w:p>
-    <w:p>
-      <w:pPr>
-        <w:pStyle w:val="Heading1"/>
-      </w:pPr>
-      <w:r>
-        <w:rPr>
-          <w:rFonts w:ascii="微软雅黑" w:hAnsi="微软雅黑" w:eastAsia="微软雅黑"/>
-          <w:color w:val="1A1A2E"/>
-        </w:rPr>
-        <w:t>自我评价</w:t>
-      </w:r>
-    </w:p>
-    <w:p>
-      <w:pPr>
-        <w:pStyle w:val="ListBullet"/>
-        <w:spacing w:after="20" w:before="0"/>
-      </w:pPr>
-      <w:r>
-        <w:rPr>
-          <w:rFonts w:ascii="微软雅黑" w:hAnsi="微软雅黑" w:eastAsia="微软雅黑"/>
-          <w:sz w:val="21"/>
-        </w:rPr>
-        <w:t xml:space="preserve">• </w:t>
-      </w:r>
-      <w:r>
-        <w:rPr>
-          <w:rFonts w:ascii="微软雅黑" w:hAnsi="微软雅黑" w:eastAsia="微软雅黑"/>
-          <w:sz w:val="21"/>
-        </w:rPr>
-        <w:t>具备扎实的AI技术功底，熟悉NLP、计算机视觉及全栈算法开发，擅长将技术与安全运营需求深度融合</w:t>
-      </w:r>
-    </w:p>
-    <w:p>
-      <w:pPr>
-        <w:pStyle w:val="ListBullet"/>
-        <w:spacing w:after="20" w:before="0"/>
-      </w:pPr>
-      <w:r>
-        <w:rPr>
-          <w:rFonts w:ascii="微软雅黑" w:hAnsi="微软雅黑" w:eastAsia="微软雅黑"/>
-          <w:sz w:val="21"/>
-        </w:rPr>
-        <w:t xml:space="preserve">• </w:t>
-      </w:r>
-      <w:r>
-        <w:rPr>
-          <w:rFonts w:ascii="微软雅黑" w:hAnsi="微软雅黑" w:eastAsia="微软雅黑"/>
-          <w:sz w:val="21"/>
-        </w:rPr>
-        <w:t>拥有出色的团队领导与协作能力，能高效带领团队完成跨领域项目，推动技术落地与创新</w:t>
-      </w:r>
-    </w:p>
-    <w:p>
-      <w:pPr>
-        <w:pStyle w:val="ListBullet"/>
-        <w:spacing w:after="20" w:before="0"/>
-      </w:pPr>
-      <w:r>
-        <w:rPr>
-          <w:rFonts w:ascii="微软雅黑" w:hAnsi="微软雅黑" w:eastAsia="微软雅黑"/>
-          <w:sz w:val="21"/>
-        </w:rPr>
-        <w:t xml:space="preserve">• </w:t>
-      </w:r>
-      <w:r>
-        <w:rPr>
-          <w:rFonts w:ascii="微软雅黑" w:hAnsi="微软雅黑" w:eastAsia="微软雅黑"/>
-          <w:sz w:val="21"/>
-        </w:rPr>
-        <w:t>逻辑清晰，注重细节，善于通过数据驱动决策，优化系统性能与用户体验</w:t>
-      </w:r>
-    </w:p>
-    <w:p>
-      <w:pPr>
-        <w:pStyle w:val="ListBullet"/>
-        <w:spacing w:after="20" w:before="0"/>
-      </w:pPr>
-      <w:r>
-        <w:rPr>
-          <w:rFonts w:ascii="微软雅黑" w:hAnsi="微软雅黑" w:eastAsia="微软雅黑"/>
-          <w:sz w:val="21"/>
-        </w:rPr>
-        <w:t xml:space="preserve">• </w:t>
-      </w:r>
-      <w:r>
-        <w:rPr>
-          <w:rFonts w:ascii="微软雅黑" w:hAnsi="微软雅黑" w:eastAsia="微软雅黑"/>
-          <w:sz w:val="21"/>
-        </w:rPr>
-        <w:t>热衷于技术探索与分享，适应快节奏环境，持续学习前沿技术</w:t>
-      </w:r>
-    </w:p>
-    <w:p>
-      <w:r>
-        <w:t>______________________________________________________________________</w:t>
-      </w:r>
-    </w:p>
-    <w:p>
-      <w:pPr>
+        <w:spacing w:before="200"/>
         <w:jc w:val="center"/>
       </w:pPr>
       <w:r>
         <w:rPr>
           <w:rFonts w:ascii="微软雅黑" w:hAnsi="微软雅黑" w:eastAsia="微软雅黑"/>
-          <w:color w:val="999999"/>
-          <w:sz w:val="17"/>
+          <w:b w:val="0"/>
+          <w:i w:val="0"/>
+          <w:color w:val="BBBBBB"/>
+          <w:sz w:val="16"/>
         </w:rPr>
         <w:t>最后更新：2026年7月</w:t>
       </w:r>
     </w:p>
     <w:sectPr>
       <w:pgSz w:w="12240" w:h="15840"/>
-      <w:pgMar w:top="1134" w:right="1247" w:bottom="1134" w:left="1247" w:header="720" w:footer="720" w:gutter="0"/>
+      <w:pgMar w:top="850" w:right="1020" w:bottom="850" w:left="1020" w:header="720" w:footer="720" w:gutter="0"/>
       <w:cols w:space="720"/>
       <w:docGrid w:linePitch="360"/>
     </w:sectPr>
@@ -1298,11 +948,11 @@
     <w:qFormat/>
     <w:rsid w:val="00FC693F"/>
     <w:pPr>
-      <w:spacing w:after="40" w:line="324" w:lineRule="auto"/>
+      <w:spacing w:after="20" w:before="0" w:line="336" w:lineRule="auto"/>
     </w:pPr>
     <w:rPr>
       <w:rFonts w:ascii="微软雅黑" w:hAnsi="微软雅黑" w:eastAsia="微软雅黑"/>
-      <w:sz w:val="21"/>
+      <w:sz w:val="20"/>
     </w:rPr>
   </w:style>
   <w:style w:type="paragraph" w:styleId="Header">

</xml_diff>

<commit_message>
Update 简历 钱佳宏.docx - compact single-page A4 resume
</commit_message>
<xml_diff>
--- a/简历 钱佳宏.docx
+++ b/简历 钱佳宏.docx
@@ -9,13 +9,13 @@
         <w:tblLook w:firstColumn="1" w:firstRow="1" w:lastColumn="0" w:lastRow="0" w:noHBand="0" w:noVBand="1" w:val="04A0"/>
       </w:tblPr>
       <w:tblGrid>
-        <w:gridCol w:w="5100"/>
-        <w:gridCol w:w="5100"/>
+        <w:gridCol w:w="4986"/>
+        <w:gridCol w:w="4986"/>
       </w:tblGrid>
       <w:tr>
         <w:tc>
           <w:tcPr>
-            <w:tcW w:type="dxa" w:w="7370"/>
+            <w:tcW w:type="dxa" w:w="7654"/>
           </w:tcPr>
           <w:p>
             <w:pPr>
@@ -26,8 +26,8 @@
               <w:rPr>
                 <w:rFonts w:ascii="微软雅黑" w:hAnsi="微软雅黑" w:eastAsia="微软雅黑"/>
                 <w:b/>
-                <w:color w:val="1A1A2E"/>
-                <w:sz w:val="44"/>
+                <w:color w:val="111111"/>
+                <w:sz w:val="48"/>
               </w:rPr>
               <w:t>个人简历</w:t>
             </w:r>
@@ -39,30 +39,12 @@
             <w:r>
               <w:rPr>
                 <w:rFonts w:ascii="微软雅黑" w:hAnsi="微软雅黑" w:eastAsia="微软雅黑"/>
-                <w:b w:val="0"/>
+                <w:b/>
                 <w:i w:val="0"/>
-                <w:color w:val="333333"/>
+                <w:color w:val="555555"/>
                 <w:sz w:val="19"/>
               </w:rPr>
-              <w:t>姓名：钱佳宏</w:t>
-            </w:r>
-          </w:p>
-          <w:p>
-            <w:pPr>
-              <w:spacing w:before="0" w:after="0"/>
-              <w:tabs>
-                <w:tab w:val="left" w:pos="4500"/>
-              </w:tabs>
-            </w:pPr>
-            <w:r>
-              <w:rPr>
-                <w:rFonts w:ascii="微软雅黑" w:hAnsi="微软雅黑" w:eastAsia="微软雅黑"/>
-                <w:b w:val="0"/>
-                <w:i w:val="0"/>
-                <w:color w:val="333333"/>
-                <w:sz w:val="19"/>
-              </w:rPr>
-              <w:t>生日：2006.05.11</w:t>
+              <w:t>姓名：</w:t>
             </w:r>
             <w:r>
               <w:rPr>
@@ -72,26 +54,25 @@
                 <w:color w:val="333333"/>
                 <w:sz w:val="19"/>
               </w:rPr>
-              <w:tab/>
-              <w:t>身高：185cm</w:t>
+              <w:t>钱佳宏</w:t>
             </w:r>
           </w:p>
           <w:p>
             <w:pPr>
               <w:spacing w:before="0" w:after="0"/>
               <w:tabs>
-                <w:tab w:val="left" w:pos="4500"/>
+                <w:tab w:val="left" w:pos="4600"/>
               </w:tabs>
             </w:pPr>
             <w:r>
               <w:rPr>
                 <w:rFonts w:ascii="微软雅黑" w:hAnsi="微软雅黑" w:eastAsia="微软雅黑"/>
-                <w:b w:val="0"/>
+                <w:b/>
                 <w:i w:val="0"/>
-                <w:color w:val="333333"/>
+                <w:color w:val="555555"/>
                 <w:sz w:val="19"/>
               </w:rPr>
-              <w:t>学历：本科</w:t>
+              <w:t>生日：</w:t>
             </w:r>
             <w:r>
               <w:rPr>
@@ -101,26 +82,18 @@
                 <w:color w:val="333333"/>
                 <w:sz w:val="19"/>
               </w:rPr>
-              <w:tab/>
-              <w:t>地址：上海市杨浦区</w:t>
+              <w:t>2006.05.11</w:t>
             </w:r>
-          </w:p>
-          <w:p>
-            <w:pPr>
-              <w:spacing w:before="0" w:after="0"/>
-              <w:tabs>
-                <w:tab w:val="left" w:pos="4500"/>
-              </w:tabs>
-            </w:pPr>
             <w:r>
               <w:rPr>
                 <w:rFonts w:ascii="微软雅黑" w:hAnsi="微软雅黑" w:eastAsia="微软雅黑"/>
-                <w:b w:val="0"/>
+                <w:b/>
                 <w:i w:val="0"/>
-                <w:color w:val="333333"/>
+                <w:color w:val="555555"/>
                 <w:sz w:val="19"/>
               </w:rPr>
-              <w:t>电话：19921057118</w:t>
+              <w:tab/>
+              <w:t>身高：</w:t>
             </w:r>
             <w:r>
               <w:rPr>
@@ -130,20 +103,117 @@
                 <w:color w:val="333333"/>
                 <w:sz w:val="19"/>
               </w:rPr>
-              <w:tab/>
-              <w:t>邮箱：aqfxz_zh@qq.com</w:t>
+              <w:t>185cm</w:t>
             </w:r>
           </w:p>
           <w:p>
             <w:pPr>
-              <w:spacing w:before="60" w:after="0"/>
+              <w:spacing w:before="0" w:after="0"/>
+              <w:tabs>
+                <w:tab w:val="left" w:pos="4600"/>
+              </w:tabs>
+            </w:pPr>
+            <w:r>
+              <w:rPr>
+                <w:rFonts w:ascii="微软雅黑" w:hAnsi="微软雅黑" w:eastAsia="微软雅黑"/>
+                <w:b/>
+                <w:i w:val="0"/>
+                <w:color w:val="555555"/>
+                <w:sz w:val="19"/>
+              </w:rPr>
+              <w:t>学历：</w:t>
+            </w:r>
+            <w:r>
+              <w:rPr>
+                <w:rFonts w:ascii="微软雅黑" w:hAnsi="微软雅黑" w:eastAsia="微软雅黑"/>
+                <w:b w:val="0"/>
+                <w:i w:val="0"/>
+                <w:color w:val="333333"/>
+                <w:sz w:val="19"/>
+              </w:rPr>
+              <w:t>本科</w:t>
+            </w:r>
+            <w:r>
+              <w:rPr>
+                <w:rFonts w:ascii="微软雅黑" w:hAnsi="微软雅黑" w:eastAsia="微软雅黑"/>
+                <w:b/>
+                <w:i w:val="0"/>
+                <w:color w:val="555555"/>
+                <w:sz w:val="19"/>
+              </w:rPr>
+              <w:tab/>
+              <w:t>地址：</w:t>
+            </w:r>
+            <w:r>
+              <w:rPr>
+                <w:rFonts w:ascii="微软雅黑" w:hAnsi="微软雅黑" w:eastAsia="微软雅黑"/>
+                <w:b w:val="0"/>
+                <w:i w:val="0"/>
+                <w:color w:val="333333"/>
+                <w:sz w:val="19"/>
+              </w:rPr>
+              <w:t>上海市杨浦区</w:t>
+            </w:r>
+          </w:p>
+          <w:p>
+            <w:pPr>
+              <w:spacing w:before="0" w:after="0"/>
+              <w:tabs>
+                <w:tab w:val="left" w:pos="4600"/>
+              </w:tabs>
+            </w:pPr>
+            <w:r>
+              <w:rPr>
+                <w:rFonts w:ascii="微软雅黑" w:hAnsi="微软雅黑" w:eastAsia="微软雅黑"/>
+                <w:b/>
+                <w:i w:val="0"/>
+                <w:color w:val="555555"/>
+                <w:sz w:val="19"/>
+              </w:rPr>
+              <w:t>电话：</w:t>
+            </w:r>
+            <w:r>
+              <w:rPr>
+                <w:rFonts w:ascii="微软雅黑" w:hAnsi="微软雅黑" w:eastAsia="微软雅黑"/>
+                <w:b w:val="0"/>
+                <w:i w:val="0"/>
+                <w:color w:val="333333"/>
+                <w:sz w:val="19"/>
+              </w:rPr>
+              <w:t>19921057118</w:t>
+            </w:r>
+            <w:r>
+              <w:rPr>
+                <w:rFonts w:ascii="微软雅黑" w:hAnsi="微软雅黑" w:eastAsia="微软雅黑"/>
+                <w:b/>
+                <w:i w:val="0"/>
+                <w:color w:val="555555"/>
+                <w:sz w:val="19"/>
+              </w:rPr>
+              <w:tab/>
+              <w:t>邮箱：</w:t>
+            </w:r>
+            <w:r>
+              <w:rPr>
+                <w:rFonts w:ascii="微软雅黑" w:hAnsi="微软雅黑" w:eastAsia="微软雅黑"/>
+                <w:b w:val="0"/>
+                <w:i w:val="0"/>
+                <w:color w:val="333333"/>
+                <w:sz w:val="19"/>
+              </w:rPr>
+              <w:t>aqfxz_zh@qq.com</w:t>
+            </w:r>
+          </w:p>
+          <w:p>
+            <w:pPr>
+              <w:spacing w:before="40"/>
             </w:pPr>
             <w:r>
               <w:rPr>
                 <w:rFonts w:ascii="微软雅黑" w:hAnsi="微软雅黑" w:eastAsia="微软雅黑"/>
                 <w:b w:val="0"/>
                 <w:i w:val="0"/>
-                <w:color w:val="555555"/>
+                <w:color w:val="666666"/>
                 <w:sz w:val="17"/>
               </w:rPr>
               <w:t>开源库：https://github.com/lxcxjxhx/HOS-Qian-jia-hong-resume</w:t>
@@ -153,7 +223,7 @@
                 <w:rFonts w:ascii="微软雅黑" w:hAnsi="微软雅黑" w:eastAsia="微软雅黑"/>
                 <w:b w:val="0"/>
                 <w:i w:val="0"/>
-                <w:color w:val="555555"/>
+                <w:color w:val="666666"/>
                 <w:sz w:val="17"/>
               </w:rPr>
               <w:t xml:space="preserve">  |  博客：https://security-hyacinth.blog.csdn.net</w:t>
@@ -166,7 +236,6 @@
           </w:tcPr>
           <w:p>
             <w:pPr>
-              <w:spacing w:before="0" w:after="0"/>
               <w:jc w:val="center"/>
             </w:pPr>
           </w:p>
@@ -187,10 +256,10 @@
                 <w:tcPr>
                   <w:tcW w:type="dxa" w:w="1417"/>
                   <w:tcBorders>
-                    <w:top w:val="single" w:sz="4" w:space="0" w:color="CCCCCC"/>
-                    <w:left w:val="single" w:sz="4" w:space="0" w:color="CCCCCC"/>
-                    <w:bottom w:val="single" w:sz="4" w:space="0" w:color="CCCCCC"/>
-                    <w:right w:val="single" w:sz="4" w:space="0" w:color="CCCCCC"/>
+                    <w:top w:val="single" w:sz="4" w:space="0" w:color="BBBBBB"/>
+                    <w:left w:val="single" w:sz="4" w:space="0" w:color="BBBBBB"/>
+                    <w:bottom w:val="single" w:sz="4" w:space="0" w:color="BBBBBB"/>
+                    <w:right w:val="single" w:sz="4" w:space="0" w:color="BBBBBB"/>
                   </w:tcBorders>
                 </w:tcPr>
                 <w:p>
@@ -229,7 +298,7 @@
     </w:p>
     <w:p>
       <w:pPr>
-        <w:spacing w:before="160" w:after="80"/>
+        <w:spacing w:before="120" w:after="80"/>
         <w:shd w:fill="1A1A2E"/>
       </w:pPr>
       <w:r>
@@ -237,14 +306,14 @@
           <w:rFonts w:ascii="微软雅黑" w:hAnsi="微软雅黑" w:eastAsia="微软雅黑"/>
           <w:b/>
           <w:color w:val="FFFFFF"/>
-          <w:sz w:val="23"/>
+          <w:sz w:val="24"/>
         </w:rPr>
         <w:t xml:space="preserve">  实习经历  </w:t>
       </w:r>
     </w:p>
     <w:p>
       <w:pPr>
-        <w:spacing w:before="80" w:after="0"/>
+        <w:spacing w:before="60" w:after="0"/>
         <w:tabs>
           <w:tab w:val="right" w:pos="9360"/>
         </w:tabs>
@@ -254,7 +323,7 @@
           <w:rFonts w:ascii="微软雅黑" w:hAnsi="微软雅黑" w:eastAsia="微软雅黑"/>
           <w:b/>
           <w:i w:val="0"/>
-          <w:color w:val="1A1A2E"/>
+          <w:color w:val="111111"/>
           <w:sz w:val="21"/>
         </w:rPr>
         <w:t>绿盟科技集团股份有限公司上海分公司</w:t>
@@ -278,8 +347,8 @@
       <w:r>
         <w:rPr>
           <w:rFonts w:ascii="微软雅黑" w:hAnsi="微软雅黑" w:eastAsia="微软雅黑"/>
-          <w:b w:val="0"/>
-          <w:i/>
+          <w:b/>
+          <w:i w:val="0"/>
           <w:color w:val="444444"/>
           <w:sz w:val="19"/>
         </w:rPr>
@@ -288,7 +357,7 @@
     </w:p>
     <w:p>
       <w:pPr>
-        <w:spacing w:before="20" w:after="40"/>
+        <w:spacing w:before="20" w:after="60"/>
         <w:ind w:firstLine="420"/>
       </w:pPr>
       <w:r>
@@ -304,7 +373,7 @@
     </w:p>
     <w:p>
       <w:pPr>
-        <w:spacing w:before="160" w:after="80"/>
+        <w:spacing w:before="120" w:after="80"/>
         <w:shd w:fill="1A1A2E"/>
       </w:pPr>
       <w:r>
@@ -312,14 +381,14 @@
           <w:rFonts w:ascii="微软雅黑" w:hAnsi="微软雅黑" w:eastAsia="微软雅黑"/>
           <w:b/>
           <w:color w:val="FFFFFF"/>
-          <w:sz w:val="23"/>
+          <w:sz w:val="24"/>
         </w:rPr>
         <w:t xml:space="preserve">  项目经历  </w:t>
       </w:r>
     </w:p>
     <w:p>
       <w:pPr>
-        <w:spacing w:before="80" w:after="0"/>
+        <w:spacing w:before="60" w:after="0"/>
         <w:tabs>
           <w:tab w:val="right" w:pos="9360"/>
         </w:tabs>
@@ -329,7 +398,7 @@
           <w:rFonts w:ascii="微软雅黑" w:hAnsi="微软雅黑" w:eastAsia="微软雅黑"/>
           <w:b/>
           <w:i w:val="0"/>
-          <w:color w:val="1A1A2E"/>
+          <w:color w:val="111111"/>
           <w:sz w:val="21"/>
         </w:rPr>
         <w:t>中美创客国奖项目"安全风信子"信息安全攻防与技术交流平台</w:t>
@@ -353,8 +422,8 @@
       <w:r>
         <w:rPr>
           <w:rFonts w:ascii="微软雅黑" w:hAnsi="微软雅黑" w:eastAsia="微软雅黑"/>
-          <w:b w:val="0"/>
-          <w:i/>
+          <w:b/>
+          <w:i w:val="0"/>
           <w:color w:val="444444"/>
           <w:sz w:val="19"/>
         </w:rPr>
@@ -363,7 +432,7 @@
     </w:p>
     <w:p>
       <w:pPr>
-        <w:spacing w:before="20" w:after="40"/>
+        <w:spacing w:before="20" w:after="60"/>
         <w:ind w:firstLine="420"/>
       </w:pPr>
       <w:r>
@@ -379,7 +448,7 @@
     </w:p>
     <w:p>
       <w:pPr>
-        <w:spacing w:before="80" w:after="0"/>
+        <w:spacing w:before="60" w:after="0"/>
         <w:tabs>
           <w:tab w:val="right" w:pos="9360"/>
         </w:tabs>
@@ -389,7 +458,7 @@
           <w:rFonts w:ascii="微软雅黑" w:hAnsi="微软雅黑" w:eastAsia="微软雅黑"/>
           <w:b/>
           <w:i w:val="0"/>
-          <w:color w:val="1A1A2E"/>
+          <w:color w:val="111111"/>
           <w:sz w:val="21"/>
         </w:rPr>
         <w:t>智医语伴机器人战队</w:t>
@@ -413,8 +482,8 @@
       <w:r>
         <w:rPr>
           <w:rFonts w:ascii="微软雅黑" w:hAnsi="微软雅黑" w:eastAsia="微软雅黑"/>
-          <w:b w:val="0"/>
-          <w:i/>
+          <w:b/>
+          <w:i w:val="0"/>
           <w:color w:val="444444"/>
           <w:sz w:val="19"/>
         </w:rPr>
@@ -423,7 +492,7 @@
     </w:p>
     <w:p>
       <w:pPr>
-        <w:spacing w:before="20" w:after="40"/>
+        <w:spacing w:before="20" w:after="60"/>
         <w:ind w:firstLine="420"/>
       </w:pPr>
       <w:r>
@@ -439,7 +508,7 @@
     </w:p>
     <w:p>
       <w:pPr>
-        <w:spacing w:before="160" w:after="80"/>
+        <w:spacing w:before="120" w:after="80"/>
         <w:shd w:fill="1A1A2E"/>
       </w:pPr>
       <w:r>
@@ -447,7 +516,7 @@
           <w:rFonts w:ascii="微软雅黑" w:hAnsi="微软雅黑" w:eastAsia="微软雅黑"/>
           <w:b/>
           <w:color w:val="FFFFFF"/>
-          <w:sz w:val="23"/>
+          <w:sz w:val="24"/>
         </w:rPr>
         <w:t xml:space="preserve">  技能 &amp; 证书  </w:t>
       </w:r>
@@ -461,7 +530,7 @@
           <w:rFonts w:ascii="微软雅黑" w:hAnsi="微软雅黑" w:eastAsia="微软雅黑"/>
           <w:b/>
           <w:i w:val="0"/>
-          <w:color w:val="1A1A2E"/>
+          <w:color w:val="111111"/>
           <w:sz w:val="20"/>
         </w:rPr>
         <w:t>语言技能：</w:t>
@@ -486,7 +555,7 @@
           <w:rFonts w:ascii="微软雅黑" w:hAnsi="微软雅黑" w:eastAsia="微软雅黑"/>
           <w:b/>
           <w:i w:val="0"/>
-          <w:color w:val="1A1A2E"/>
+          <w:color w:val="111111"/>
           <w:sz w:val="20"/>
         </w:rPr>
         <w:t>专业技能：</w:t>
@@ -511,7 +580,7 @@
           <w:rFonts w:ascii="微软雅黑" w:hAnsi="微软雅黑" w:eastAsia="微软雅黑"/>
           <w:b/>
           <w:i w:val="0"/>
-          <w:color w:val="1A1A2E"/>
+          <w:color w:val="111111"/>
           <w:sz w:val="20"/>
         </w:rPr>
         <w:t>办公技能：</w:t>
@@ -529,7 +598,7 @@
     </w:p>
     <w:p>
       <w:pPr>
-        <w:spacing w:before="160" w:after="80"/>
+        <w:spacing w:before="120" w:after="80"/>
         <w:shd w:fill="1A1A2E"/>
       </w:pPr>
       <w:r>
@@ -537,7 +606,7 @@
           <w:rFonts w:ascii="微软雅黑" w:hAnsi="微软雅黑" w:eastAsia="微软雅黑"/>
           <w:b/>
           <w:color w:val="FFFFFF"/>
-          <w:sz w:val="23"/>
+          <w:sz w:val="24"/>
         </w:rPr>
         <w:t xml:space="preserve">  自我介绍  </w:t>
       </w:r>
@@ -560,7 +629,7 @@
     </w:p>
     <w:p>
       <w:pPr>
-        <w:spacing w:before="200"/>
+        <w:spacing w:before="160"/>
         <w:jc w:val="center"/>
       </w:pPr>
       <w:r>
@@ -576,7 +645,7 @@
     </w:p>
     <w:sectPr>
       <w:pgSz w:w="12240" w:h="15840"/>
-      <w:pgMar w:top="850" w:right="1020" w:bottom="850" w:left="1020" w:header="720" w:footer="720" w:gutter="0"/>
+      <w:pgMar w:top="1020" w:right="1134" w:bottom="794" w:left="1134" w:header="720" w:footer="720" w:gutter="0"/>
       <w:cols w:space="720"/>
       <w:docGrid w:linePitch="360"/>
     </w:sectPr>

</xml_diff>

<commit_message>
Update 简历 钱佳宏.docx - add photo and fix layout
</commit_message>
<xml_diff>
--- a/简历 钱佳宏.docx
+++ b/简历 钱佳宏.docx
@@ -9,8 +9,8 @@
         <w:tblLook w:firstColumn="1" w:firstRow="1" w:lastColumn="0" w:lastRow="0" w:noHBand="0" w:noVBand="1" w:val="04A0"/>
       </w:tblPr>
       <w:tblGrid>
-        <w:gridCol w:w="4986"/>
-        <w:gridCol w:w="4986"/>
+        <w:gridCol w:w="5100"/>
+        <w:gridCol w:w="5100"/>
       </w:tblGrid>
       <w:tr>
         <w:tc>
@@ -19,7 +19,7 @@
           </w:tcPr>
           <w:p>
             <w:pPr>
-              <w:spacing w:after="80"/>
+              <w:spacing w:after="60"/>
               <w:jc w:val="left"/>
             </w:pPr>
             <w:r>
@@ -27,7 +27,7 @@
                 <w:rFonts w:ascii="微软雅黑" w:hAnsi="微软雅黑" w:eastAsia="微软雅黑"/>
                 <w:b/>
                 <w:color w:val="111111"/>
-                <w:sz w:val="48"/>
+                <w:sz w:val="44"/>
               </w:rPr>
               <w:t>个人简历</w:t>
             </w:r>
@@ -42,7 +42,7 @@
                 <w:b/>
                 <w:i w:val="0"/>
                 <w:color w:val="555555"/>
-                <w:sz w:val="19"/>
+                <w:sz w:val="18"/>
               </w:rPr>
               <w:t>姓名：</w:t>
             </w:r>
@@ -52,7 +52,7 @@
                 <w:b w:val="0"/>
                 <w:i w:val="0"/>
                 <w:color w:val="333333"/>
-                <w:sz w:val="19"/>
+                <w:sz w:val="18"/>
               </w:rPr>
               <w:t>钱佳宏</w:t>
             </w:r>
@@ -70,7 +70,7 @@
                 <w:b/>
                 <w:i w:val="0"/>
                 <w:color w:val="555555"/>
-                <w:sz w:val="19"/>
+                <w:sz w:val="18"/>
               </w:rPr>
               <w:t>生日：</w:t>
             </w:r>
@@ -80,7 +80,7 @@
                 <w:b w:val="0"/>
                 <w:i w:val="0"/>
                 <w:color w:val="333333"/>
-                <w:sz w:val="19"/>
+                <w:sz w:val="18"/>
               </w:rPr>
               <w:t>2006.05.11</w:t>
             </w:r>
@@ -90,7 +90,7 @@
                 <w:b/>
                 <w:i w:val="0"/>
                 <w:color w:val="555555"/>
-                <w:sz w:val="19"/>
+                <w:sz w:val="18"/>
               </w:rPr>
               <w:tab/>
               <w:t>身高：</w:t>
@@ -101,7 +101,7 @@
                 <w:b w:val="0"/>
                 <w:i w:val="0"/>
                 <w:color w:val="333333"/>
-                <w:sz w:val="19"/>
+                <w:sz w:val="18"/>
               </w:rPr>
               <w:t>185cm</w:t>
             </w:r>
@@ -119,7 +119,7 @@
                 <w:b/>
                 <w:i w:val="0"/>
                 <w:color w:val="555555"/>
-                <w:sz w:val="19"/>
+                <w:sz w:val="18"/>
               </w:rPr>
               <w:t>学历：</w:t>
             </w:r>
@@ -129,7 +129,7 @@
                 <w:b w:val="0"/>
                 <w:i w:val="0"/>
                 <w:color w:val="333333"/>
-                <w:sz w:val="19"/>
+                <w:sz w:val="18"/>
               </w:rPr>
               <w:t>本科</w:t>
             </w:r>
@@ -139,7 +139,7 @@
                 <w:b/>
                 <w:i w:val="0"/>
                 <w:color w:val="555555"/>
-                <w:sz w:val="19"/>
+                <w:sz w:val="18"/>
               </w:rPr>
               <w:tab/>
               <w:t>地址：</w:t>
@@ -150,7 +150,7 @@
                 <w:b w:val="0"/>
                 <w:i w:val="0"/>
                 <w:color w:val="333333"/>
-                <w:sz w:val="19"/>
+                <w:sz w:val="18"/>
               </w:rPr>
               <w:t>上海市杨浦区</w:t>
             </w:r>
@@ -168,7 +168,7 @@
                 <w:b/>
                 <w:i w:val="0"/>
                 <w:color w:val="555555"/>
-                <w:sz w:val="19"/>
+                <w:sz w:val="18"/>
               </w:rPr>
               <w:t>电话：</w:t>
             </w:r>
@@ -178,7 +178,7 @@
                 <w:b w:val="0"/>
                 <w:i w:val="0"/>
                 <w:color w:val="333333"/>
-                <w:sz w:val="19"/>
+                <w:sz w:val="18"/>
               </w:rPr>
               <w:t>19921057118</w:t>
             </w:r>
@@ -188,7 +188,7 @@
                 <w:b/>
                 <w:i w:val="0"/>
                 <w:color w:val="555555"/>
-                <w:sz w:val="19"/>
+                <w:sz w:val="18"/>
               </w:rPr>
               <w:tab/>
               <w:t>邮箱：</w:t>
@@ -199,7 +199,7 @@
                 <w:b w:val="0"/>
                 <w:i w:val="0"/>
                 <w:color w:val="333333"/>
-                <w:sz w:val="19"/>
+                <w:sz w:val="18"/>
               </w:rPr>
               <w:t>aqfxz_zh@qq.com</w:t>
             </w:r>
@@ -214,19 +214,24 @@
                 <w:b w:val="0"/>
                 <w:i w:val="0"/>
                 <w:color w:val="666666"/>
-                <w:sz w:val="17"/>
+                <w:sz w:val="16"/>
               </w:rPr>
               <w:t>开源库：https://github.com/lxcxjxhx/HOS-Qian-jia-hong-resume</w:t>
             </w:r>
+          </w:p>
+          <w:p>
+            <w:pPr>
+              <w:spacing w:before="0"/>
+            </w:pPr>
             <w:r>
               <w:rPr>
                 <w:rFonts w:ascii="微软雅黑" w:hAnsi="微软雅黑" w:eastAsia="微软雅黑"/>
                 <w:b w:val="0"/>
                 <w:i w:val="0"/>
                 <w:color w:val="666666"/>
-                <w:sz w:val="17"/>
+                <w:sz w:val="16"/>
               </w:rPr>
-              <w:t xml:space="preserve">  |  博客：https://security-hyacinth.blog.csdn.net</w:t>
+              <w:t>博客：https://security-hyacinth.blog.csdn.net</w:t>
             </w:r>
           </w:p>
         </w:tc>
@@ -236,55 +241,24 @@
           </w:tcPr>
           <w:p>
             <w:pPr>
+              <w:spacing w:before="0" w:after="0"/>
               <w:jc w:val="center"/>
             </w:pPr>
+            <w:r>
+              <w:rPr>
+                <w:rFonts w:ascii="微软雅黑" w:hAnsi="微软雅黑" w:eastAsia="微软雅黑"/>
+                <w:b w:val="0"/>
+                <w:i w:val="0"/>
+                <w:color w:val="AAAAAA"/>
+                <w:sz w:val="14"/>
+              </w:rPr>
+              <w:t>一寸</w:t>
+              <w:br/>
+              <w:t>证件照</w:t>
+              <w:br/>
+              <w:t>位置</w:t>
+            </w:r>
           </w:p>
-          <w:tbl>
-            <w:tblPr>
-              <w:tblW w:type="auto" w:w="0"/>
-              <w:jc w:val="center"/>
-              <w:tblLook w:firstColumn="1" w:firstRow="1" w:lastColumn="0" w:lastRow="0" w:noHBand="0" w:noVBand="1" w:val="04A0"/>
-            </w:tblPr>
-            <w:tblGrid>
-              <w:gridCol w:w="1701"/>
-            </w:tblGrid>
-            <w:tr>
-              <w:trPr>
-                <w:trHeight w:val="720" w:hRule="atLeast"/>
-              </w:trPr>
-              <w:tc>
-                <w:tcPr>
-                  <w:tcW w:type="dxa" w:w="1417"/>
-                  <w:tcBorders>
-                    <w:top w:val="single" w:sz="4" w:space="0" w:color="BBBBBB"/>
-                    <w:left w:val="single" w:sz="4" w:space="0" w:color="BBBBBB"/>
-                    <w:bottom w:val="single" w:sz="4" w:space="0" w:color="BBBBBB"/>
-                    <w:right w:val="single" w:sz="4" w:space="0" w:color="BBBBBB"/>
-                  </w:tcBorders>
-                </w:tcPr>
-                <w:p>
-                  <w:pPr>
-                    <w:jc w:val="center"/>
-                  </w:pPr>
-                  <w:r>
-                    <w:rPr>
-                      <w:rFonts w:ascii="微软雅黑" w:hAnsi="微软雅黑" w:eastAsia="微软雅黑"/>
-                      <w:b w:val="0"/>
-                      <w:i w:val="0"/>
-                      <w:color w:val="AAAAAA"/>
-                      <w:sz w:val="14"/>
-                    </w:rPr>
-                    <w:t>一寸</w:t>
-                    <w:br/>
-                    <w:t>证件照</w:t>
-                    <w:br/>
-                    <w:t>位置</w:t>
-                  </w:r>
-                </w:p>
-              </w:tc>
-            </w:tr>
-          </w:tbl>
-          <w:p/>
         </w:tc>
       </w:tr>
     </w:tbl>
@@ -298,7 +272,7 @@
     </w:p>
     <w:p>
       <w:pPr>
-        <w:spacing w:before="120" w:after="80"/>
+        <w:spacing w:before="100" w:after="60"/>
         <w:shd w:fill="1A1A2E"/>
       </w:pPr>
       <w:r>
@@ -306,7 +280,7 @@
           <w:rFonts w:ascii="微软雅黑" w:hAnsi="微软雅黑" w:eastAsia="微软雅黑"/>
           <w:b/>
           <w:color w:val="FFFFFF"/>
-          <w:sz w:val="24"/>
+          <w:sz w:val="22"/>
         </w:rPr>
         <w:t xml:space="preserve">  实习经历  </w:t>
       </w:r>
@@ -324,7 +298,7 @@
           <w:b/>
           <w:i w:val="0"/>
           <w:color w:val="111111"/>
-          <w:sz w:val="21"/>
+          <w:sz w:val="20"/>
         </w:rPr>
         <w:t>绿盟科技集团股份有限公司上海分公司</w:t>
       </w:r>
@@ -334,7 +308,7 @@
           <w:b w:val="0"/>
           <w:i w:val="0"/>
           <w:color w:val="666666"/>
-          <w:sz w:val="18"/>
+          <w:sz w:val="17"/>
         </w:rPr>
         <w:tab/>
         <w:t>2025.7 – 2026.7</w:t>
@@ -350,7 +324,7 @@
           <w:b/>
           <w:i w:val="0"/>
           <w:color w:val="444444"/>
-          <w:sz w:val="19"/>
+          <w:sz w:val="18"/>
         </w:rPr>
         <w:t>实习安全工程师</w:t>
       </w:r>
@@ -366,14 +340,14 @@
           <w:b w:val="0"/>
           <w:i w:val="0"/>
           <w:color w:val="333333"/>
-          <w:sz w:val="20"/>
+          <w:sz w:val="19"/>
         </w:rPr>
         <w:t>在绿盟科技实习期间，我负责防火墙、IDS/IPS、WAF、RSAS等安全设备的部署、策略配置及基础运维，深度参与多个金融、制造行业客户的等保合规与安全加固项目，熟练掌握主流安全产品的实施流程与故障排查方法。在此基础上，我自主研发提效工具 HOS-LS（github.com/lxcxjxhx/HOS-LS），并成功将其提交至绿盟工程交付工具平台；主动加入"安全运营–AI赋能运营专项组"，贡献文档库 BOS-NI（github.com/lxcxjxhx/BOS-NI），协助团队探索大模型在告警分析、知识检索等场景中的落地应用。上述经历体现了我对信息安全&amp;AI的主动思考、动手落地能力及工程交付意识。</w:t>
       </w:r>
     </w:p>
     <w:p>
       <w:pPr>
-        <w:spacing w:before="120" w:after="80"/>
+        <w:spacing w:before="100" w:after="60"/>
         <w:shd w:fill="1A1A2E"/>
       </w:pPr>
       <w:r>
@@ -381,7 +355,7 @@
           <w:rFonts w:ascii="微软雅黑" w:hAnsi="微软雅黑" w:eastAsia="微软雅黑"/>
           <w:b/>
           <w:color w:val="FFFFFF"/>
-          <w:sz w:val="24"/>
+          <w:sz w:val="22"/>
         </w:rPr>
         <w:t xml:space="preserve">  项目经历  </w:t>
       </w:r>
@@ -399,7 +373,7 @@
           <w:b/>
           <w:i w:val="0"/>
           <w:color w:val="111111"/>
-          <w:sz w:val="21"/>
+          <w:sz w:val="20"/>
         </w:rPr>
         <w:t>中美创客国奖项目"安全风信子"信息安全攻防与技术交流平台</w:t>
       </w:r>
@@ -409,7 +383,7 @@
           <w:b w:val="0"/>
           <w:i w:val="0"/>
           <w:color w:val="666666"/>
-          <w:sz w:val="18"/>
+          <w:sz w:val="17"/>
         </w:rPr>
         <w:tab/>
         <w:t>2024.9 – 2025.6</w:t>
@@ -425,7 +399,7 @@
           <w:b/>
           <w:i w:val="0"/>
           <w:color w:val="444444"/>
-          <w:sz w:val="19"/>
+          <w:sz w:val="18"/>
         </w:rPr>
         <w:t>负责人 &amp; 软件开发</w:t>
       </w:r>
@@ -441,7 +415,7 @@
           <w:b w:val="0"/>
           <w:i w:val="0"/>
           <w:color w:val="333333"/>
-          <w:sz w:val="20"/>
+          <w:sz w:val="19"/>
         </w:rPr>
         <w:t>带领六人团队联合开发"安全风信子"AI+信息安全攻防与学习平台，聚焦终端威胁检测、AI辅助漏洞分析、命令行智能建议与日志审计学习等核心功能，适配多终端与实训场景。主导平台安全体系搭建，负责渗透测试辅助模块、指令行为分析、攻击日志归类与可视化响应等核心环节，实现对异常行为的快速识别与反馈。结合Qwen等大模型构建AI安全对抗引擎，融合知识图谱与强化学习技术，提升平台在漏洞挖掘、溯源分析等方向的能力。项目已获中美创客分赛道国奖，软件著作权，正在申请专利，致力于打造面向实训场景的智能化攻防演练平台。</w:t>
       </w:r>
@@ -459,7 +433,7 @@
           <w:b/>
           <w:i w:val="0"/>
           <w:color w:val="111111"/>
-          <w:sz w:val="21"/>
+          <w:sz w:val="20"/>
         </w:rPr>
         <w:t>智医语伴机器人战队</w:t>
       </w:r>
@@ -469,7 +443,7 @@
           <w:b w:val="0"/>
           <w:i w:val="0"/>
           <w:color w:val="666666"/>
-          <w:sz w:val="18"/>
+          <w:sz w:val="17"/>
         </w:rPr>
         <w:tab/>
         <w:t>2023.9 – 2024.6</w:t>
@@ -485,7 +459,7 @@
           <w:b/>
           <w:i w:val="0"/>
           <w:color w:val="444444"/>
-          <w:sz w:val="19"/>
+          <w:sz w:val="18"/>
         </w:rPr>
         <w:t>队员 &amp; 人工智能应用开发</w:t>
       </w:r>
@@ -501,14 +475,14 @@
           <w:b w:val="0"/>
           <w:i w:val="0"/>
           <w:color w:val="333333"/>
-          <w:sz w:val="20"/>
+          <w:sz w:val="19"/>
         </w:rPr>
         <w:t>参与英特尔人工智能创新应用大赛，依托"AI PC"平台开发医疗辅助项目"智医语伴机器人"，旨在提升基层诊疗效率与医患沟通体验。负责项目中语音数据隐私保护机制设计，主导通信链路加密、敏感内容识别、日志合规审计与安全传输策略实施，确保医疗场景下的数据安全与系统稳定性。同时参与语音识别优化与用户交互流程设计，提升系统准确率与使用体验。项目成功入围创新创业专项赛（GBAC240303106392），获得主办方高度认可，体现AI在医疗数据安全落地中的可行性。</w:t>
       </w:r>
     </w:p>
     <w:p>
       <w:pPr>
-        <w:spacing w:before="120" w:after="80"/>
+        <w:spacing w:before="100" w:after="60"/>
         <w:shd w:fill="1A1A2E"/>
       </w:pPr>
       <w:r>
@@ -516,7 +490,7 @@
           <w:rFonts w:ascii="微软雅黑" w:hAnsi="微软雅黑" w:eastAsia="微软雅黑"/>
           <w:b/>
           <w:color w:val="FFFFFF"/>
-          <w:sz w:val="24"/>
+          <w:sz w:val="22"/>
         </w:rPr>
         <w:t xml:space="preserve">  技能 &amp; 证书  </w:t>
       </w:r>
@@ -531,7 +505,7 @@
           <w:b/>
           <w:i w:val="0"/>
           <w:color w:val="111111"/>
-          <w:sz w:val="20"/>
+          <w:sz w:val="19"/>
         </w:rPr>
         <w:t>语言技能：</w:t>
       </w:r>
@@ -541,7 +515,7 @@
           <w:b w:val="0"/>
           <w:i w:val="0"/>
           <w:color w:val="333333"/>
-          <w:sz w:val="20"/>
+          <w:sz w:val="19"/>
         </w:rPr>
         <w:t>英语CET6（411），普通话二级乙等</w:t>
       </w:r>
@@ -556,7 +530,7 @@
           <w:b/>
           <w:i w:val="0"/>
           <w:color w:val="111111"/>
-          <w:sz w:val="20"/>
+          <w:sz w:val="19"/>
         </w:rPr>
         <w:t>专业技能：</w:t>
       </w:r>
@@ -566,7 +540,7 @@
           <w:b w:val="0"/>
           <w:i w:val="0"/>
           <w:color w:val="333333"/>
-          <w:sz w:val="20"/>
+          <w:sz w:val="19"/>
         </w:rPr>
         <w:t>熟悉Python及PyTorch框架，具备大模型（RAG、代码生成）训练调优、模型压缩蒸馏实战经验。同时掌握强化学习、AI Agent开发应用方法，拥有系统安全分析与漏洞挖掘能力，熟悉MCP、skills、langchain等前沿技术架构。</w:t>
       </w:r>
@@ -581,7 +555,7 @@
           <w:b/>
           <w:i w:val="0"/>
           <w:color w:val="111111"/>
-          <w:sz w:val="20"/>
+          <w:sz w:val="19"/>
         </w:rPr>
         <w:t>办公技能：</w:t>
       </w:r>
@@ -591,14 +565,14 @@
           <w:b w:val="0"/>
           <w:i w:val="0"/>
           <w:color w:val="333333"/>
-          <w:sz w:val="20"/>
+          <w:sz w:val="19"/>
         </w:rPr>
         <w:t>EFG创业训练营结业证书（第75期），计算机一级证书，C2驾照</w:t>
       </w:r>
     </w:p>
     <w:p>
       <w:pPr>
-        <w:spacing w:before="120" w:after="80"/>
+        <w:spacing w:before="100" w:after="60"/>
         <w:shd w:fill="1A1A2E"/>
       </w:pPr>
       <w:r>
@@ -606,7 +580,7 @@
           <w:rFonts w:ascii="微软雅黑" w:hAnsi="微软雅黑" w:eastAsia="微软雅黑"/>
           <w:b/>
           <w:color w:val="FFFFFF"/>
-          <w:sz w:val="24"/>
+          <w:sz w:val="22"/>
         </w:rPr>
         <w:t xml:space="preserve">  自我介绍  </w:t>
       </w:r>
@@ -622,14 +596,14 @@
           <w:b w:val="0"/>
           <w:i w:val="0"/>
           <w:color w:val="333333"/>
-          <w:sz w:val="20"/>
+          <w:sz w:val="19"/>
         </w:rPr>
         <w:t>具备扎实的AI技术功底，熟悉自然语言处理（NLP）、计算机视觉及全栈算法开发，大模型应用、数据结构优化与信息安全体系设计。擅长将技术与运营需求深度融合，快速学习并掌握前沿技术，解决复杂问题。拥有出色的团队领导与协作能力，能高效带领团队完成跨领域项目，推动技术落地与创新。逻辑清晰，注重细节，善于通过数据驱动决策，优化系统性能与用户体验。热衷于技术探索与分享，适应快节奏环境，涵盖计算机视觉、NLP、全栈算法及技术运营。</w:t>
       </w:r>
     </w:p>
     <w:p>
       <w:pPr>
-        <w:spacing w:before="160"/>
+        <w:spacing w:before="120"/>
         <w:jc w:val="center"/>
       </w:pPr>
       <w:r>
@@ -638,14 +612,14 @@
           <w:b w:val="0"/>
           <w:i w:val="0"/>
           <w:color w:val="BBBBBB"/>
-          <w:sz w:val="16"/>
+          <w:sz w:val="15"/>
         </w:rPr>
         <w:t>最后更新：2026年7月</w:t>
       </w:r>
     </w:p>
     <w:sectPr>
       <w:pgSz w:w="12240" w:h="15840"/>
-      <w:pgMar w:top="1020" w:right="1134" w:bottom="794" w:left="1134" w:header="720" w:footer="720" w:gutter="0"/>
+      <w:pgMar w:top="680" w:right="1020" w:bottom="454" w:left="1020" w:header="720" w:footer="720" w:gutter="0"/>
       <w:cols w:space="720"/>
       <w:docGrid w:linePitch="360"/>
     </w:sectPr>
@@ -1021,7 +995,7 @@
     </w:pPr>
     <w:rPr>
       <w:rFonts w:ascii="微软雅黑" w:hAnsi="微软雅黑" w:eastAsia="微软雅黑"/>
-      <w:sz w:val="20"/>
+      <w:sz w:val="19"/>
     </w:rPr>
   </w:style>
   <w:style w:type="paragraph" w:styleId="Header">

</xml_diff>

<commit_message>
Auto-convert resume to DOCX and PDF
  Generated from resume.html using GitHub Actions
  - PDF: weasyprint with CJK font support
  - DOCX: python-docx with precise A4 layout
</commit_message>
<xml_diff>
--- a/简历 钱佳宏.docx
+++ b/简历 钱佳宏.docx
@@ -83,7 +83,16 @@
           <w:color w:val="555555"/>
           <w:sz w:val="16"/>
         </w:rPr>
-        <w:t>开源库：github.com/lxcxjxhx/HOS-Qian-jia-hong-resume    博客：security-hyacinth.blog.csdn.net    arXiv：arxiv.org/search/?query=JH-Qian    LinkedIn：linkedin.com/in/佳宏-钱</w:t>
+        <w:t>开源库：github.com/lxcxjxhx/HOS-Qian-jia-hong-resume    博客：security-hyacinth.blog.csdn.net</w:t>
+      </w:r>
+      <w:r>
+        <w:rPr>
+          <w:rFonts w:ascii="Noto Sans CJK SC" w:hAnsi="Noto Sans CJK SC" w:eastAsia="Noto Sans CJK SC"/>
+          <w:b w:val="0"/>
+          <w:color w:val="555555"/>
+          <w:sz w:val="16"/>
+        </w:rPr>
+        <w:t>arXiv：arxiv.org/search/?query=JH-Qian    LinkedIn：linkedin.com/in/佳宏-钱</w:t>
       </w:r>
     </w:p>
     <w:p>

</xml_diff>